<commit_message>
Removes defunct TA forms
</commit_message>
<xml_diff>
--- a/content/support-access/access/Cirrus-TA-Grant-form.docx
+++ b/content/support-access/access/Cirrus-TA-Grant-form.docx
@@ -30,6 +30,12 @@
           <w:sz w:val="44"/>
         </w:rPr>
       </w:pPr>
+      <w:r>
+        <w:rPr>
+          <w:sz w:val="44"/>
+        </w:rPr>
+        <w:t xml:space="preserve">UKRI </w:t>
+      </w:r>
       <w:r>
         <w:rPr>
           <w:sz w:val="44"/>
@@ -92,7 +98,7 @@
                         <a:effectLst/>
                         <a:extLst>
                           <a:ext uri="{C572A759-6A51-4108-AA02-DFA0A04FC94B}">
-                            <ma14:wrappingTextBoxFlag xmlns:ma14="http://schemas.microsoft.com/office/mac/drawingml/2011/main" xmlns:w="http://schemas.openxmlformats.org/wordprocessingml/2006/main" xmlns:w10="urn:schemas-microsoft-com:office:word" xmlns:v="urn:schemas-microsoft-com:vml" xmlns:o="urn:schemas-microsoft-com:office:office" xmlns:mv="urn:schemas-microsoft-com:mac:vml" xmlns:mo="http://schemas.microsoft.com/office/mac/office/2008/main" xmlns=""/>
+                            <ma14:wrappingTextBoxFlag xmlns="" xmlns:mo="http://schemas.microsoft.com/office/mac/office/2008/main" xmlns:mv="urn:schemas-microsoft-com:mac:vml" xmlns:o="urn:schemas-microsoft-com:office:office" xmlns:v="urn:schemas-microsoft-com:vml" xmlns:w10="urn:schemas-microsoft-com:office:word" xmlns:w="http://schemas.openxmlformats.org/wordprocessingml/2006/main" xmlns:ma14="http://schemas.microsoft.com/office/mac/drawingml/2011/main"/>
                           </a:ext>
                         </a:extLst>
                       </wps:spPr>
@@ -124,7 +130,21 @@
                                 <w:rFonts w:asciiTheme="minorHAnsi" w:hAnsiTheme="minorHAnsi"/>
                                 <w:b/>
                               </w:rPr>
-                              <w:t xml:space="preserve">Note: this form is for grant </w:t>
+                              <w:t xml:space="preserve">Note: this form is for </w:t>
+                            </w:r>
+                            <w:r>
+                              <w:rPr>
+                                <w:rFonts w:asciiTheme="minorHAnsi" w:hAnsiTheme="minorHAnsi"/>
+                                <w:b/>
+                              </w:rPr>
+                              <w:t xml:space="preserve">UKRI </w:t>
+                            </w:r>
+                            <w:r>
+                              <w:rPr>
+                                <w:rFonts w:asciiTheme="minorHAnsi" w:hAnsiTheme="minorHAnsi"/>
+                                <w:b/>
+                              </w:rPr>
+                              <w:t xml:space="preserve">grant </w:t>
                             </w:r>
                             <w:r>
                               <w:rPr>
@@ -214,7 +234,21 @@
                           <w:rFonts w:asciiTheme="minorHAnsi" w:hAnsiTheme="minorHAnsi"/>
                           <w:b/>
                         </w:rPr>
-                        <w:t xml:space="preserve">Note: this form is for grant </w:t>
+                        <w:t xml:space="preserve">Note: this form is for </w:t>
+                      </w:r>
+                      <w:r>
+                        <w:rPr>
+                          <w:rFonts w:asciiTheme="minorHAnsi" w:hAnsiTheme="minorHAnsi"/>
+                          <w:b/>
+                        </w:rPr>
+                        <w:t xml:space="preserve">UKRI </w:t>
+                      </w:r>
+                      <w:r>
+                        <w:rPr>
+                          <w:rFonts w:asciiTheme="minorHAnsi" w:hAnsiTheme="minorHAnsi"/>
+                          <w:b/>
+                        </w:rPr>
+                        <w:t xml:space="preserve">grant </w:t>
                       </w:r>
                       <w:r>
                         <w:rPr>
@@ -6663,14 +6697,128 @@
         <w:rPr>
           <w:rFonts w:asciiTheme="minorHAnsi" w:hAnsiTheme="minorHAnsi" w:cs="Arial"/>
           <w:b/>
-        </w:rPr>
-      </w:pPr>
-      <w:r>
-        <w:rPr>
-          <w:rFonts w:asciiTheme="minorHAnsi" w:hAnsiTheme="minorHAnsi" w:cs="Arial"/>
-          <w:b/>
-        </w:rPr>
-        <w:t xml:space="preserve">7.1 </w:t>
+          <w:bCs/>
+        </w:rPr>
+      </w:pPr>
+      <w:r>
+        <w:rPr>
+          <w:rFonts w:asciiTheme="minorHAnsi" w:hAnsiTheme="minorHAnsi" w:cs="Arial"/>
+          <w:b/>
+          <w:bCs/>
+        </w:rPr>
+        <w:t>7.</w:t>
+      </w:r>
+      <w:r>
+        <w:rPr>
+          <w:rFonts w:asciiTheme="minorHAnsi" w:hAnsiTheme="minorHAnsi" w:cs="Arial"/>
+          <w:b/>
+          <w:bCs/>
+        </w:rPr>
+        <w:t>1</w:t>
+      </w:r>
+      <w:r>
+        <w:rPr>
+          <w:rFonts w:asciiTheme="minorHAnsi" w:hAnsiTheme="minorHAnsi" w:cs="Arial"/>
+          <w:b/>
+          <w:bCs/>
+        </w:rPr>
+        <w:t xml:space="preserve"> </w:t>
+      </w:r>
+      <w:r>
+        <w:rPr>
+          <w:rFonts w:asciiTheme="minorHAnsi" w:hAnsiTheme="minorHAnsi" w:cs="Arial"/>
+          <w:b/>
+          <w:bCs/>
+        </w:rPr>
+        <w:t>State the category of data that will be uploaded/generated on Cirrus from the categories described at</w:t>
+      </w:r>
+      <w:r>
+        <w:rPr>
+          <w:rFonts w:asciiTheme="minorHAnsi" w:hAnsiTheme="minorHAnsi" w:cs="Arial"/>
+          <w:b/>
+          <w:bCs/>
+        </w:rPr>
+        <w:t xml:space="preserve">: </w:t>
+      </w:r>
+      <w:hyperlink r:id="rId13" w:history="1">
+        <w:r>
+          <w:rPr>
+            <w:rStyle w:val="Hyperlink"/>
+            <w:rFonts w:asciiTheme="minorHAnsi" w:hAnsiTheme="minorHAnsi" w:cs="Arial"/>
+            <w:b/>
+            <w:bCs/>
+          </w:rPr>
+          <w:t>https://edinburgh-international-data-facility.ed.ac.uk/about/policies/third-party-data</w:t>
+        </w:r>
+      </w:hyperlink>
+      <w:r>
+        <w:rPr>
+          <w:rFonts w:asciiTheme="minorHAnsi" w:hAnsiTheme="minorHAnsi" w:cs="Arial"/>
+          <w:b/>
+          <w:bCs/>
+        </w:rPr>
+        <w:t>?</w:t>
+      </w:r>
+      <w:r>
+        <w:rPr>
+          <w:rFonts w:asciiTheme="minorHAnsi" w:hAnsiTheme="minorHAnsi" w:cs="Arial"/>
+          <w:b/>
+          <w:bCs/>
+        </w:rPr>
+        <w:t xml:space="preserve"> </w:t>
+      </w:r>
+      <w:r>
+        <w:rPr>
+          <w:rFonts w:asciiTheme="minorHAnsi" w:hAnsiTheme="minorHAnsi" w:cs="Arial"/>
+          <w:b/>
+          <w:bCs/>
+        </w:rPr>
+        <w:t>If you need to, please include details of relevant data usage agreements with your access request.</w:t>
+      </w:r>
+    </w:p>
+    <w:p>
+      <w:pPr>
+        <w:spacing w:before="120" w:after="120"/>
+        <w:rPr>
+          <w:rFonts w:asciiTheme="minorHAnsi" w:hAnsiTheme="minorHAnsi" w:cs="Arial"/>
+        </w:rPr>
+      </w:pPr>
+      <w:r>
+        <w:rPr>
+          <w:rFonts w:asciiTheme="minorHAnsi" w:hAnsiTheme="minorHAnsi" w:cs="Arial"/>
+          <w:highlight w:val="cyan"/>
+        </w:rPr>
+        <w:t>[Describe what category from the link above your data falls under and, if required provide links to relevant data usage agreements. If your data is not Government Data, Personal Data, Copyrighted Data or Ethically-Sensitive Data, you can state “No sensitive data” in answer to this question.]</w:t>
+      </w:r>
+    </w:p>
+    <w:p>
+      <w:pPr>
+        <w:spacing w:before="120" w:after="120"/>
+        <w:rPr>
+          <w:rFonts w:asciiTheme="minorHAnsi" w:hAnsiTheme="minorHAnsi" w:cs="Arial"/>
+          <w:b/>
+        </w:rPr>
+      </w:pPr>
+      <w:r>
+        <w:rPr>
+          <w:rFonts w:asciiTheme="minorHAnsi" w:hAnsiTheme="minorHAnsi" w:cs="Arial"/>
+          <w:b/>
+        </w:rPr>
+        <w:t>7.</w:t>
+      </w:r>
+      <w:r>
+        <w:rPr>
+          <w:rFonts w:asciiTheme="minorHAnsi" w:hAnsiTheme="minorHAnsi" w:cs="Arial"/>
+          <w:b/>
+        </w:rPr>
+        <w:t>2</w:t>
+      </w:r>
+      <w:r>
+        <w:rPr>
+          <w:rFonts w:asciiTheme="minorHAnsi" w:hAnsiTheme="minorHAnsi" w:cs="Arial"/>
+          <w:b/>
+        </w:rPr>
+        <w:t xml:space="preserve"> </w:t>
       </w:r>
       <w:r>
         <w:rPr>
@@ -6708,7 +6856,21 @@
           <w:rFonts w:asciiTheme="minorHAnsi" w:hAnsiTheme="minorHAnsi" w:cs="Arial"/>
           <w:b/>
         </w:rPr>
-        <w:t>7.2 How much data is read in by each job?</w:t>
+        <w:t>7.</w:t>
+      </w:r>
+      <w:r>
+        <w:rPr>
+          <w:rFonts w:asciiTheme="minorHAnsi" w:hAnsiTheme="minorHAnsi" w:cs="Arial"/>
+          <w:b/>
+        </w:rPr>
+        <w:t>3</w:t>
+      </w:r>
+      <w:r>
+        <w:rPr>
+          <w:rFonts w:asciiTheme="minorHAnsi" w:hAnsiTheme="minorHAnsi" w:cs="Arial"/>
+          <w:b/>
+        </w:rPr>
+        <w:t xml:space="preserve"> How much data is read in by each job?</w:t>
       </w:r>
     </w:p>
     <w:p>
@@ -6774,7 +6936,21 @@
           <w:rFonts w:asciiTheme="minorHAnsi" w:hAnsiTheme="minorHAnsi" w:cs="Arial"/>
           <w:b/>
         </w:rPr>
-        <w:t>7.3 How much data is produced by each job?</w:t>
+        <w:t>7.</w:t>
+      </w:r>
+      <w:r>
+        <w:rPr>
+          <w:rFonts w:asciiTheme="minorHAnsi" w:hAnsiTheme="minorHAnsi" w:cs="Arial"/>
+          <w:b/>
+        </w:rPr>
+        <w:t>4</w:t>
+      </w:r>
+      <w:r>
+        <w:rPr>
+          <w:rFonts w:asciiTheme="minorHAnsi" w:hAnsiTheme="minorHAnsi" w:cs="Arial"/>
+          <w:b/>
+        </w:rPr>
+        <w:t xml:space="preserve"> How much data is produced by each job?</w:t>
       </w:r>
     </w:p>
     <w:p>
@@ -6847,7 +7023,21 @@
           <w:rFonts w:asciiTheme="minorHAnsi" w:hAnsiTheme="minorHAnsi" w:cs="Arial"/>
           <w:b/>
         </w:rPr>
-        <w:t>7.4 What percentage of the produced data do you expect to transfer</w:t>
+        <w:t>7.</w:t>
+      </w:r>
+      <w:r>
+        <w:rPr>
+          <w:rFonts w:asciiTheme="minorHAnsi" w:hAnsiTheme="minorHAnsi" w:cs="Arial"/>
+          <w:b/>
+        </w:rPr>
+        <w:t>5</w:t>
+      </w:r>
+      <w:r>
+        <w:rPr>
+          <w:rFonts w:asciiTheme="minorHAnsi" w:hAnsiTheme="minorHAnsi" w:cs="Arial"/>
+          <w:b/>
+        </w:rPr>
+        <w:t xml:space="preserve"> What percentage of the produced data do you expect to transfer</w:t>
       </w:r>
       <w:r>
         <w:rPr>
@@ -6898,7 +7088,14 @@
           <w:rFonts w:asciiTheme="minorHAnsi" w:hAnsiTheme="minorHAnsi" w:cs="Arial"/>
           <w:b/>
         </w:rPr>
-        <w:t>7.5</w:t>
+        <w:t>7.</w:t>
+      </w:r>
+      <w:r>
+        <w:rPr>
+          <w:rFonts w:asciiTheme="minorHAnsi" w:hAnsiTheme="minorHAnsi" w:cs="Arial"/>
+          <w:b/>
+        </w:rPr>
+        <w:t>6</w:t>
       </w:r>
       <w:r>
         <w:rPr>
@@ -7342,6 +7539,12 @@
               <w:rPr>
                 <w:rFonts w:asciiTheme="minorHAnsi" w:hAnsiTheme="minorHAnsi"/>
               </w:rPr>
+              <w:t xml:space="preserve">Is the data suitable for processing on Cirrus? </w:t>
+            </w:r>
+            <w:r>
+              <w:rPr>
+                <w:rFonts w:asciiTheme="minorHAnsi" w:hAnsiTheme="minorHAnsi"/>
+              </w:rPr>
               <w:t>Is the data management and transfer plan reasonable and technically sound?</w:t>
             </w:r>
           </w:p>
@@ -7595,12 +7798,10 @@
       </w:r>
     </w:p>
     <w:sectPr>
-      <w:headerReference w:type="even" r:id="rId13"/>
-      <w:headerReference w:type="default" r:id="rId14"/>
-      <w:footerReference w:type="even" r:id="rId15"/>
+      <w:headerReference w:type="even" r:id="rId14"/>
+      <w:headerReference w:type="default" r:id="rId15"/>
       <w:footerReference w:type="default" r:id="rId16"/>
       <w:headerReference w:type="first" r:id="rId17"/>
-      <w:footerReference w:type="first" r:id="rId18"/>
       <w:footnotePr>
         <w:pos w:val="beneathText"/>
       </w:footnotePr>
@@ -7633,16 +7834,6 @@
 </file>
 
 <file path=word/footer1.xml><?xml version="1.0" encoding="utf-8"?>
-<w:ftr xmlns:wpc="http://schemas.microsoft.com/office/word/2010/wordprocessingCanvas" xmlns:cx="http://schemas.microsoft.com/office/drawing/2014/chartex" xmlns:cx1="http://schemas.microsoft.com/office/drawing/2015/9/8/chartex" xmlns:cx2="http://schemas.microsoft.com/office/drawing/2015/10/21/chartex" xmlns:cx3="http://schemas.microsoft.com/office/drawing/2016/5/9/chartex" xmlns:cx4="http://schemas.microsoft.com/office/drawing/2016/5/10/chartex" xmlns:cx5="http://schemas.microsoft.com/office/drawing/2016/5/11/chartex" xmlns:cx6="http://schemas.microsoft.com/office/drawing/2016/5/12/chartex" xmlns:cx7="http://schemas.microsoft.com/office/drawing/2016/5/13/chartex" xmlns:cx8="http://schemas.microsoft.com/office/drawing/2016/5/14/chartex" xmlns:mc="http://schemas.openxmlformats.org/markup-compatibility/2006" xmlns:aink="http://schemas.microsoft.com/office/drawing/2016/ink" xmlns:am3d="http://schemas.microsoft.com/office/drawing/2017/model3d" xmlns:o="urn:schemas-microsoft-com:office:office" xmlns:oel="http://schemas.microsoft.com/office/2019/extlst" xmlns:r="http://schemas.openxmlformats.org/officeDocument/2006/relationships" xmlns:m="http://schemas.openxmlformats.org/officeDocument/2006/math" xmlns:v="urn:schemas-microsoft-com:vml" xmlns:wp14="http://schemas.microsoft.com/office/word/2010/wordprocessingDrawing" xmlns:wp="http://schemas.openxmlformats.org/drawingml/2006/wordprocessingDrawing" xmlns:w10="urn:schemas-microsoft-com:office:word" xmlns:w="http://schemas.openxmlformats.org/wordprocessingml/2006/main" xmlns:w14="http://schemas.microsoft.com/office/word/2010/wordml" xmlns:w15="http://schemas.microsoft.com/office/word/2012/wordml" xmlns:w16cex="http://schemas.microsoft.com/office/word/2018/wordml/cex" xmlns:w16cid="http://schemas.microsoft.com/office/word/2016/wordml/cid" xmlns:w16="http://schemas.microsoft.com/office/word/2018/wordml" xmlns:w16du="http://schemas.microsoft.com/office/word/2023/wordml/word16du" xmlns:w16sdtdh="http://schemas.microsoft.com/office/word/2020/wordml/sdtdatahash" xmlns:w16sdtfl="http://schemas.microsoft.com/office/word/2024/wordml/sdtformatlock" xmlns:w16se="http://schemas.microsoft.com/office/word/2015/wordml/symex" xmlns:wpg="http://schemas.microsoft.com/office/word/2010/wordprocessingGroup" xmlns:wpi="http://schemas.microsoft.com/office/word/2010/wordprocessingInk" xmlns:wne="http://schemas.microsoft.com/office/word/2006/wordml" xmlns:wps="http://schemas.microsoft.com/office/word/2010/wordprocessingShape" mc:Ignorable="w14 w15 w16se w16cid w16 w16cex w16sdtdh w16sdtfl w16du wp14">
-  <w:p>
-    <w:pPr>
-      <w:pStyle w:val="Footer"/>
-    </w:pPr>
-  </w:p>
-</w:ftr>
-</file>
-
-<file path=word/footer2.xml><?xml version="1.0" encoding="utf-8"?>
 <w:ftr xmlns:wpc="http://schemas.microsoft.com/office/word/2010/wordprocessingCanvas" xmlns:cx="http://schemas.microsoft.com/office/drawing/2014/chartex" xmlns:cx1="http://schemas.microsoft.com/office/drawing/2015/9/8/chartex" xmlns:cx2="http://schemas.microsoft.com/office/drawing/2015/10/21/chartex" xmlns:cx3="http://schemas.microsoft.com/office/drawing/2016/5/9/chartex" xmlns:cx4="http://schemas.microsoft.com/office/drawing/2016/5/10/chartex" xmlns:cx5="http://schemas.microsoft.com/office/drawing/2016/5/11/chartex" xmlns:cx6="http://schemas.microsoft.com/office/drawing/2016/5/12/chartex" xmlns:cx7="http://schemas.microsoft.com/office/drawing/2016/5/13/chartex" xmlns:cx8="http://schemas.microsoft.com/office/drawing/2016/5/14/chartex" xmlns:mc="http://schemas.openxmlformats.org/markup-compatibility/2006" xmlns:aink="http://schemas.microsoft.com/office/drawing/2016/ink" xmlns:am3d="http://schemas.microsoft.com/office/drawing/2017/model3d" xmlns:o="urn:schemas-microsoft-com:office:office" xmlns:oel="http://schemas.microsoft.com/office/2019/extlst" xmlns:r="http://schemas.openxmlformats.org/officeDocument/2006/relationships" xmlns:m="http://schemas.openxmlformats.org/officeDocument/2006/math" xmlns:v="urn:schemas-microsoft-com:vml" xmlns:wp14="http://schemas.microsoft.com/office/word/2010/wordprocessingDrawing" xmlns:wp="http://schemas.openxmlformats.org/drawingml/2006/wordprocessingDrawing" xmlns:w10="urn:schemas-microsoft-com:office:word" xmlns:w="http://schemas.openxmlformats.org/wordprocessingml/2006/main" xmlns:w14="http://schemas.microsoft.com/office/word/2010/wordml" xmlns:w15="http://schemas.microsoft.com/office/word/2012/wordml" xmlns:w16cex="http://schemas.microsoft.com/office/word/2018/wordml/cex" xmlns:w16cid="http://schemas.microsoft.com/office/word/2016/wordml/cid" xmlns:w16="http://schemas.microsoft.com/office/word/2018/wordml" xmlns:w16du="http://schemas.microsoft.com/office/word/2023/wordml/word16du" xmlns:w16sdtdh="http://schemas.microsoft.com/office/word/2020/wordml/sdtdatahash" xmlns:w16sdtfl="http://schemas.microsoft.com/office/word/2024/wordml/sdtformatlock" xmlns:w16se="http://schemas.microsoft.com/office/word/2015/wordml/symex" xmlns:wpg="http://schemas.microsoft.com/office/word/2010/wordprocessingGroup" xmlns:wpi="http://schemas.microsoft.com/office/word/2010/wordprocessingInk" xmlns:wne="http://schemas.microsoft.com/office/word/2006/wordml" xmlns:wps="http://schemas.microsoft.com/office/word/2010/wordprocessingShape" mc:Ignorable="w14 w15 w16se w16cid w16 w16cex w16sdtdh w16sdtfl w16du wp14">
   <w:p>
     <w:pPr>
@@ -7670,6 +7861,14 @@
         <w:szCs w:val="20"/>
       </w:rPr>
       <w:t xml:space="preserve"> </w:t>
+    </w:r>
+    <w:r>
+      <w:rPr>
+        <w:rFonts w:asciiTheme="minorHAnsi" w:hAnsiTheme="minorHAnsi"/>
+        <w:sz w:val="20"/>
+        <w:szCs w:val="20"/>
+      </w:rPr>
+      <w:t xml:space="preserve">UKRI </w:t>
     </w:r>
     <w:r>
       <w:rPr>
@@ -7855,16 +8054,6 @@
       </w:rPr>
       <w:fldChar w:fldCharType="end"/>
     </w:r>
-  </w:p>
-</w:ftr>
-</file>
-
-<file path=word/footer3.xml><?xml version="1.0" encoding="utf-8"?>
-<w:ftr xmlns:wpc="http://schemas.microsoft.com/office/word/2010/wordprocessingCanvas" xmlns:cx="http://schemas.microsoft.com/office/drawing/2014/chartex" xmlns:cx1="http://schemas.microsoft.com/office/drawing/2015/9/8/chartex" xmlns:cx2="http://schemas.microsoft.com/office/drawing/2015/10/21/chartex" xmlns:cx3="http://schemas.microsoft.com/office/drawing/2016/5/9/chartex" xmlns:cx4="http://schemas.microsoft.com/office/drawing/2016/5/10/chartex" xmlns:cx5="http://schemas.microsoft.com/office/drawing/2016/5/11/chartex" xmlns:cx6="http://schemas.microsoft.com/office/drawing/2016/5/12/chartex" xmlns:cx7="http://schemas.microsoft.com/office/drawing/2016/5/13/chartex" xmlns:cx8="http://schemas.microsoft.com/office/drawing/2016/5/14/chartex" xmlns:mc="http://schemas.openxmlformats.org/markup-compatibility/2006" xmlns:aink="http://schemas.microsoft.com/office/drawing/2016/ink" xmlns:am3d="http://schemas.microsoft.com/office/drawing/2017/model3d" xmlns:o="urn:schemas-microsoft-com:office:office" xmlns:oel="http://schemas.microsoft.com/office/2019/extlst" xmlns:r="http://schemas.openxmlformats.org/officeDocument/2006/relationships" xmlns:m="http://schemas.openxmlformats.org/officeDocument/2006/math" xmlns:v="urn:schemas-microsoft-com:vml" xmlns:wp14="http://schemas.microsoft.com/office/word/2010/wordprocessingDrawing" xmlns:wp="http://schemas.openxmlformats.org/drawingml/2006/wordprocessingDrawing" xmlns:w10="urn:schemas-microsoft-com:office:word" xmlns:w="http://schemas.openxmlformats.org/wordprocessingml/2006/main" xmlns:w14="http://schemas.microsoft.com/office/word/2010/wordml" xmlns:w15="http://schemas.microsoft.com/office/word/2012/wordml" xmlns:w16cex="http://schemas.microsoft.com/office/word/2018/wordml/cex" xmlns:w16cid="http://schemas.microsoft.com/office/word/2016/wordml/cid" xmlns:w16="http://schemas.microsoft.com/office/word/2018/wordml" xmlns:w16du="http://schemas.microsoft.com/office/word/2023/wordml/word16du" xmlns:w16sdtdh="http://schemas.microsoft.com/office/word/2020/wordml/sdtdatahash" xmlns:w16sdtfl="http://schemas.microsoft.com/office/word/2024/wordml/sdtformatlock" xmlns:w16se="http://schemas.microsoft.com/office/word/2015/wordml/symex" xmlns:wpg="http://schemas.microsoft.com/office/word/2010/wordprocessingGroup" xmlns:wpi="http://schemas.microsoft.com/office/word/2010/wordprocessingInk" xmlns:wne="http://schemas.microsoft.com/office/word/2006/wordml" xmlns:wps="http://schemas.microsoft.com/office/word/2010/wordprocessingShape" mc:Ignorable="w14 w15 w16se w16cid w16 w16cex w16sdtdh w16sdtfl w16du wp14">
-  <w:p>
-    <w:pPr>
-      <w:pStyle w:val="Footer"/>
-    </w:pPr>
   </w:p>
 </w:ftr>
 </file>

</xml_diff>

<commit_message>
Updates Cirrus TA form
</commit_message>
<xml_diff>
--- a/content/support-access/access/Cirrus-TA-Grant-form.docx
+++ b/content/support-access/access/Cirrus-TA-Grant-form.docx
@@ -98,7 +98,7 @@
                         <a:effectLst/>
                         <a:extLst>
                           <a:ext uri="{C572A759-6A51-4108-AA02-DFA0A04FC94B}">
-                            <ma14:wrappingTextBoxFlag xmlns="" xmlns:mo="http://schemas.microsoft.com/office/mac/office/2008/main" xmlns:mv="urn:schemas-microsoft-com:mac:vml" xmlns:o="urn:schemas-microsoft-com:office:office" xmlns:v="urn:schemas-microsoft-com:vml" xmlns:w10="urn:schemas-microsoft-com:office:word" xmlns:w="http://schemas.openxmlformats.org/wordprocessingml/2006/main" xmlns:ma14="http://schemas.microsoft.com/office/mac/drawingml/2011/main"/>
+                            <ma14:wrappingTextBoxFlag xmlns:ma14="http://schemas.microsoft.com/office/mac/drawingml/2011/main" xmlns:w="http://schemas.openxmlformats.org/wordprocessingml/2006/main" xmlns:w10="urn:schemas-microsoft-com:office:word" xmlns:v="urn:schemas-microsoft-com:vml" xmlns:o="urn:schemas-microsoft-com:office:office" xmlns:mv="urn:schemas-microsoft-com:mac:vml" xmlns:mo="http://schemas.microsoft.com/office/mac/office/2008/main" xmlns=""/>
                           </a:ext>
                         </a:extLst>
                       </wps:spPr>
@@ -570,61 +570,6 @@
     </w:p>
     <w:p>
       <w:pPr>
-        <w:pStyle w:val="ListParagraph"/>
-        <w:numPr>
-          <w:ilvl w:val="0"/>
-          <w:numId w:val="13"/>
-        </w:numPr>
-        <w:rPr>
-          <w:rFonts w:asciiTheme="minorHAnsi" w:hAnsiTheme="minorHAnsi"/>
-        </w:rPr>
-      </w:pPr>
-      <w:r>
-        <w:rPr>
-          <w:rFonts w:asciiTheme="minorHAnsi" w:hAnsiTheme="minorHAnsi"/>
-        </w:rPr>
-        <w:t>You must supply quantitative evidence that the codes to be used scale to the core counts requested</w:t>
-      </w:r>
-      <w:r>
-        <w:rPr>
-          <w:rFonts w:asciiTheme="minorHAnsi" w:hAnsiTheme="minorHAnsi"/>
-        </w:rPr>
-        <w:t xml:space="preserve"> (or</w:t>
-      </w:r>
-      <w:r>
-        <w:rPr>
-          <w:rFonts w:asciiTheme="minorHAnsi" w:hAnsiTheme="minorHAnsi"/>
-        </w:rPr>
-        <w:t xml:space="preserve"> technical</w:t>
-      </w:r>
-      <w:r>
-        <w:rPr>
-          <w:rFonts w:asciiTheme="minorHAnsi" w:hAnsiTheme="minorHAnsi"/>
-        </w:rPr>
-        <w:t xml:space="preserve"> </w:t>
-      </w:r>
-      <w:r>
-        <w:rPr>
-          <w:rFonts w:asciiTheme="minorHAnsi" w:hAnsiTheme="minorHAnsi"/>
-        </w:rPr>
-        <w:t xml:space="preserve">justification of why Cirrus </w:t>
-      </w:r>
-      <w:r>
-        <w:rPr>
-          <w:rFonts w:asciiTheme="minorHAnsi" w:hAnsiTheme="minorHAnsi"/>
-        </w:rPr>
-        <w:t>is the correct resource if you are running serial jobs)</w:t>
-      </w:r>
-      <w:r>
-        <w:rPr>
-          <w:rFonts w:asciiTheme="minorHAnsi" w:hAnsiTheme="minorHAnsi"/>
-        </w:rPr>
-        <w:t>. More details on the evidence required can be found in Section 1, Part 6.</w:t>
-      </w:r>
-    </w:p>
-    <w:p>
-      <w:pPr>
-        <w:ind w:left="360"/>
         <w:rPr>
           <w:rFonts w:asciiTheme="minorHAnsi" w:hAnsiTheme="minorHAnsi"/>
         </w:rPr>
@@ -2266,6 +2211,18 @@
     </w:p>
     <w:p>
       <w:pPr>
+        <w:tabs>
+          <w:tab w:val="left" w:pos="360"/>
+          <w:tab w:val="left" w:pos="792"/>
+        </w:tabs>
+        <w:ind w:left="360"/>
+        <w:rPr>
+          <w:rFonts w:asciiTheme="minorHAnsi" w:hAnsiTheme="minorHAnsi"/>
+        </w:rPr>
+      </w:pPr>
+    </w:p>
+    <w:p>
+      <w:pPr>
         <w:numPr>
           <w:ilvl w:val="1"/>
           <w:numId w:val="3"/>
@@ -2287,6 +2244,7 @@
           <w:rFonts w:ascii="Calibri" w:hAnsi="Calibri"/>
           <w:b/>
         </w:rPr>
+        <w:lastRenderedPageBreak/>
         <w:t>Brief Project Summary</w:t>
       </w:r>
     </w:p>
@@ -2307,7 +2265,6 @@
           <w:rFonts w:ascii="Calibri" w:hAnsi="Calibri"/>
           <w:bCs/>
         </w:rPr>
-        <w:lastRenderedPageBreak/>
         <w:t xml:space="preserve">Please note that </w:t>
       </w:r>
       <w:r>
@@ -4832,6 +4789,13 @@
           <w:b/>
         </w:rPr>
         <w:lastRenderedPageBreak/>
+        <w:t xml:space="preserve"> </w:t>
+      </w:r>
+      <w:r>
+        <w:rPr>
+          <w:rFonts w:asciiTheme="minorHAnsi" w:hAnsiTheme="minorHAnsi"/>
+          <w:b/>
+        </w:rPr>
         <w:t>Description of Resources Requested</w:t>
       </w:r>
     </w:p>
@@ -5031,7 +4995,14 @@
           <w:b/>
         </w:rPr>
         <w:lastRenderedPageBreak/>
-        <w:t xml:space="preserve">Scaling Evidence to Support Proposed Use of Cirrus </w:t>
+        <w:t xml:space="preserve"> </w:t>
+      </w:r>
+      <w:r>
+        <w:rPr>
+          <w:rFonts w:asciiTheme="minorHAnsi" w:hAnsiTheme="minorHAnsi"/>
+          <w:b/>
+        </w:rPr>
+        <w:t>Data Management and Transfer</w:t>
       </w:r>
     </w:p>
     <w:p>
@@ -5045,1702 +5016,71 @@
         <w:rPr>
           <w:rFonts w:asciiTheme="minorHAnsi" w:hAnsiTheme="minorHAnsi" w:cs="Arial"/>
         </w:rPr>
-        <w:t>The number of C</w:t>
-      </w:r>
-      <w:r>
-        <w:rPr>
-          <w:rFonts w:asciiTheme="minorHAnsi" w:hAnsiTheme="minorHAnsi" w:cs="Arial"/>
-        </w:rPr>
-        <w:t>ore-</w:t>
-      </w:r>
-      <w:r>
-        <w:rPr>
-          <w:rFonts w:asciiTheme="minorHAnsi" w:hAnsiTheme="minorHAnsi" w:cs="Arial"/>
-        </w:rPr>
-        <w:t>h</w:t>
-      </w:r>
-      <w:r>
-        <w:rPr>
-          <w:rFonts w:asciiTheme="minorHAnsi" w:hAnsiTheme="minorHAnsi" w:cs="Arial"/>
-        </w:rPr>
-        <w:t xml:space="preserve"> requested and the job sizes</w:t>
-      </w:r>
-      <w:r>
-        <w:rPr>
-          <w:rFonts w:asciiTheme="minorHAnsi" w:hAnsiTheme="minorHAnsi" w:cs="Arial"/>
-        </w:rPr>
-        <w:t xml:space="preserve"> specified in Section </w:t>
-      </w:r>
-      <w:r>
-        <w:rPr>
-          <w:rFonts w:asciiTheme="minorHAnsi" w:hAnsiTheme="minorHAnsi" w:cs="Arial"/>
-        </w:rPr>
-        <w:t>6</w:t>
-      </w:r>
-      <w:r>
-        <w:rPr>
-          <w:rFonts w:asciiTheme="minorHAnsi" w:hAnsiTheme="minorHAnsi" w:cs="Arial"/>
-        </w:rPr>
-        <w:t xml:space="preserve"> above must be </w:t>
-      </w:r>
-      <w:r>
-        <w:rPr>
-          <w:rFonts w:asciiTheme="minorHAnsi" w:hAnsiTheme="minorHAnsi" w:cs="Arial"/>
-        </w:rPr>
-        <w:t>backed up by quantitative evidence that the code scales efficiently to the job sizes requested</w:t>
-      </w:r>
-      <w:r>
-        <w:rPr>
-          <w:rFonts w:asciiTheme="minorHAnsi" w:hAnsiTheme="minorHAnsi" w:cs="Arial"/>
-        </w:rPr>
-        <w:t xml:space="preserve"> in number of cores/nodes</w:t>
-      </w:r>
-      <w:r>
-        <w:rPr>
-          <w:rFonts w:asciiTheme="minorHAnsi" w:hAnsiTheme="minorHAnsi" w:cs="Arial"/>
-        </w:rPr>
-        <w:t xml:space="preserve"> (unless the jobs are all serial)</w:t>
-      </w:r>
-      <w:r>
-        <w:rPr>
-          <w:rFonts w:asciiTheme="minorHAnsi" w:hAnsiTheme="minorHAnsi" w:cs="Arial"/>
-        </w:rPr>
-        <w:t xml:space="preserve">. </w:t>
-      </w:r>
-      <w:r>
-        <w:rPr>
-          <w:rFonts w:asciiTheme="minorHAnsi" w:hAnsiTheme="minorHAnsi" w:cs="Arial"/>
-        </w:rPr>
-        <w:t>The evidence must include:</w:t>
-      </w:r>
-    </w:p>
-    <w:p>
-      <w:pPr>
-        <w:pStyle w:val="ListParagraph"/>
-        <w:numPr>
-          <w:ilvl w:val="0"/>
-          <w:numId w:val="14"/>
-        </w:numPr>
+        <w:t>This section asks some basic questions ab</w:t>
+      </w:r>
+      <w:r>
+        <w:rPr>
+          <w:rFonts w:asciiTheme="minorHAnsi" w:hAnsiTheme="minorHAnsi" w:cs="Arial"/>
+        </w:rPr>
+        <w:t>out the data generated on Cirrus</w:t>
+      </w:r>
+      <w:r>
+        <w:rPr>
+          <w:rFonts w:asciiTheme="minorHAnsi" w:hAnsiTheme="minorHAnsi" w:cs="Arial"/>
+        </w:rPr>
+        <w:t xml:space="preserve"> by the proposed calculations. </w:t>
+      </w:r>
+    </w:p>
+    <w:p>
+      <w:pPr>
         <w:spacing w:before="120" w:after="120"/>
         <w:rPr>
           <w:rFonts w:asciiTheme="minorHAnsi" w:hAnsiTheme="minorHAnsi" w:cs="Arial"/>
-        </w:rPr>
-      </w:pPr>
-      <w:r>
-        <w:rPr>
-          <w:rFonts w:asciiTheme="minorHAnsi" w:hAnsiTheme="minorHAnsi" w:cs="Arial"/>
-        </w:rPr>
-        <w:t xml:space="preserve">A graph or table of the </w:t>
-      </w:r>
-      <w:r>
-        <w:rPr>
-          <w:rFonts w:asciiTheme="minorHAnsi" w:hAnsiTheme="minorHAnsi" w:cs="Arial"/>
-          <w:i/>
-        </w:rPr>
-        <w:t>runtimes</w:t>
-      </w:r>
-      <w:r>
-        <w:rPr>
-          <w:rFonts w:asciiTheme="minorHAnsi" w:hAnsiTheme="minorHAnsi" w:cs="Arial"/>
-        </w:rPr>
-        <w:t xml:space="preserve"> and </w:t>
-      </w:r>
-      <w:r>
-        <w:rPr>
-          <w:rFonts w:asciiTheme="minorHAnsi" w:hAnsiTheme="minorHAnsi" w:cs="Arial"/>
-          <w:i/>
-        </w:rPr>
-        <w:t>speedup</w:t>
-      </w:r>
-      <w:r>
-        <w:rPr>
-          <w:rFonts w:asciiTheme="minorHAnsi" w:hAnsiTheme="minorHAnsi" w:cs="Arial"/>
-        </w:rPr>
-        <w:t xml:space="preserve"> for a similar problem using the code on </w:t>
-      </w:r>
-      <w:r>
-        <w:rPr>
-          <w:rFonts w:asciiTheme="minorHAnsi" w:hAnsiTheme="minorHAnsi" w:cs="Arial"/>
-        </w:rPr>
-        <w:t>Cirrus</w:t>
-      </w:r>
-      <w:r>
-        <w:rPr>
-          <w:rFonts w:asciiTheme="minorHAnsi" w:hAnsiTheme="minorHAnsi" w:cs="Arial"/>
-        </w:rPr>
-        <w:t xml:space="preserve"> or another HPC system.</w:t>
-      </w:r>
-      <w:r>
-        <w:rPr>
-          <w:rFonts w:asciiTheme="minorHAnsi" w:hAnsiTheme="minorHAnsi" w:cs="Arial"/>
-        </w:rPr>
-        <w:t xml:space="preserve"> The speedup should be provided relative to the smallest number of cores that can be used feasibly (see examples below).</w:t>
-      </w:r>
-    </w:p>
-    <w:p>
-      <w:pPr>
-        <w:spacing w:before="120" w:after="120"/>
-        <w:rPr>
-          <w:rFonts w:asciiTheme="minorHAnsi" w:hAnsiTheme="minorHAnsi" w:cs="Arial"/>
-        </w:rPr>
-      </w:pPr>
-      <w:r>
-        <w:rPr>
-          <w:rFonts w:asciiTheme="minorHAnsi" w:hAnsiTheme="minorHAnsi" w:cs="Arial"/>
-        </w:rPr>
-        <w:t>If the application is developing new algorithms for which scaling data is not yet available</w:t>
-      </w:r>
-      <w:r>
-        <w:rPr>
-          <w:rFonts w:asciiTheme="minorHAnsi" w:hAnsiTheme="minorHAnsi" w:cs="Arial"/>
-        </w:rPr>
-        <w:t>,</w:t>
-      </w:r>
-      <w:r>
-        <w:rPr>
-          <w:rFonts w:asciiTheme="minorHAnsi" w:hAnsiTheme="minorHAnsi" w:cs="Arial"/>
-        </w:rPr>
-        <w:t xml:space="preserve"> then the proposed scaling shou</w:t>
-      </w:r>
-      <w:r>
-        <w:rPr>
-          <w:rFonts w:asciiTheme="minorHAnsi" w:hAnsiTheme="minorHAnsi" w:cs="Arial"/>
-        </w:rPr>
-        <w:t>l</w:t>
-      </w:r>
-      <w:r>
-        <w:rPr>
-          <w:rFonts w:asciiTheme="minorHAnsi" w:hAnsiTheme="minorHAnsi" w:cs="Arial"/>
-        </w:rPr>
-        <w:t>d</w:t>
-      </w:r>
-      <w:r>
-        <w:rPr>
-          <w:rFonts w:asciiTheme="minorHAnsi" w:hAnsiTheme="minorHAnsi" w:cs="Arial"/>
-        </w:rPr>
-        <w:t xml:space="preserve"> be justified with appropriate references and descriptions.</w:t>
-      </w:r>
-    </w:p>
-    <w:p>
-      <w:pPr>
-        <w:spacing w:before="120" w:after="120"/>
-        <w:rPr>
-          <w:rFonts w:asciiTheme="minorHAnsi" w:hAnsiTheme="minorHAnsi" w:cs="Arial"/>
-        </w:rPr>
-      </w:pPr>
-      <w:r>
-        <w:rPr>
-          <w:rFonts w:asciiTheme="minorHAnsi" w:hAnsiTheme="minorHAnsi" w:cs="Arial"/>
-        </w:rPr>
-        <w:t>If you plan to run serial calculations only then please provide a technical justification of why Cirrus is the correct resource for this work.</w:t>
-      </w:r>
-    </w:p>
-    <w:p>
-      <w:pPr>
-        <w:spacing w:before="120" w:after="120"/>
-        <w:rPr>
-          <w:rFonts w:asciiTheme="minorHAnsi" w:hAnsiTheme="minorHAnsi" w:cs="Arial"/>
-        </w:rPr>
-      </w:pPr>
-      <w:r>
-        <w:rPr>
-          <w:rFonts w:asciiTheme="minorHAnsi" w:hAnsiTheme="minorHAnsi" w:cs="Arial"/>
-        </w:rPr>
-        <w:t>If you requir</w:t>
-      </w:r>
-      <w:r>
-        <w:rPr>
-          <w:rFonts w:asciiTheme="minorHAnsi" w:hAnsiTheme="minorHAnsi" w:cs="Arial"/>
-        </w:rPr>
-        <w:t>e help in evaluating the speedup</w:t>
-      </w:r>
-      <w:r>
-        <w:rPr>
-          <w:rFonts w:asciiTheme="minorHAnsi" w:hAnsiTheme="minorHAnsi" w:cs="Arial"/>
-        </w:rPr>
-        <w:t xml:space="preserve"> of a code on a particular problem</w:t>
-      </w:r>
-      <w:r>
-        <w:rPr>
-          <w:rFonts w:asciiTheme="minorHAnsi" w:hAnsiTheme="minorHAnsi" w:cs="Arial"/>
-        </w:rPr>
-        <w:t>,</w:t>
-      </w:r>
-      <w:r>
-        <w:rPr>
-          <w:rFonts w:asciiTheme="minorHAnsi" w:hAnsiTheme="minorHAnsi" w:cs="Arial"/>
-        </w:rPr>
-        <w:t xml:space="preserve"> then please contact the </w:t>
-      </w:r>
-      <w:r>
-        <w:rPr>
-          <w:rFonts w:asciiTheme="minorHAnsi" w:hAnsiTheme="minorHAnsi" w:cs="Arial"/>
-        </w:rPr>
-        <w:t xml:space="preserve">Cirrus </w:t>
-      </w:r>
-      <w:r>
-        <w:rPr>
-          <w:rFonts w:asciiTheme="minorHAnsi" w:hAnsiTheme="minorHAnsi" w:cs="Arial"/>
-        </w:rPr>
-        <w:t>Service Desk</w:t>
-      </w:r>
-      <w:r>
-        <w:rPr>
-          <w:rFonts w:asciiTheme="minorHAnsi" w:hAnsiTheme="minorHAnsi" w:cs="Arial"/>
-        </w:rPr>
-        <w:t xml:space="preserve"> (support@cirrus.ac.uk</w:t>
-      </w:r>
-      <w:r>
-        <w:rPr>
-          <w:rFonts w:asciiTheme="minorHAnsi" w:hAnsiTheme="minorHAnsi" w:cs="Arial"/>
-        </w:rPr>
-        <w:t>)</w:t>
-      </w:r>
-    </w:p>
-    <w:p>
-      <w:pPr>
-        <w:spacing w:before="120" w:after="120"/>
-        <w:rPr>
-          <w:rFonts w:asciiTheme="minorHAnsi" w:hAnsiTheme="minorHAnsi" w:cs="Arial"/>
-        </w:rPr>
-      </w:pPr>
-      <w:r>
-        <w:rPr>
-          <w:rFonts w:asciiTheme="minorHAnsi" w:hAnsiTheme="minorHAnsi" w:cs="Arial"/>
-          <w:highlight w:val="cyan"/>
-        </w:rPr>
-        <w:t>[Enter scaling evidence</w:t>
-      </w:r>
-      <w:r>
-        <w:rPr>
-          <w:rFonts w:asciiTheme="minorHAnsi" w:hAnsiTheme="minorHAnsi" w:cs="Arial"/>
-          <w:highlight w:val="cyan"/>
-        </w:rPr>
-        <w:t>/justification</w:t>
-      </w:r>
-      <w:r>
-        <w:rPr>
-          <w:rFonts w:asciiTheme="minorHAnsi" w:hAnsiTheme="minorHAnsi" w:cs="Arial"/>
-          <w:highlight w:val="cyan"/>
-        </w:rPr>
-        <w:t>]</w:t>
-      </w:r>
-    </w:p>
-    <w:p>
-      <w:pPr>
-        <w:spacing w:before="120" w:after="120"/>
-        <w:rPr>
-          <w:rFonts w:asciiTheme="minorHAnsi" w:hAnsiTheme="minorHAnsi" w:cs="Arial"/>
-        </w:rPr>
-      </w:pPr>
-      <w:r>
-        <w:rPr>
-          <w:rFonts w:asciiTheme="minorHAnsi" w:hAnsiTheme="minorHAnsi" w:cs="Arial"/>
-        </w:rPr>
-        <w:t>Example speedup table:</w:t>
-      </w:r>
-    </w:p>
-    <w:tbl>
-      <w:tblPr>
-        <w:tblStyle w:val="TableGrid"/>
-        <w:tblW w:w="0" w:type="auto"/>
-        <w:jc w:val="center"/>
-        <w:tblLook w:val="04A0" w:firstRow="1" w:lastRow="0" w:firstColumn="1" w:lastColumn="0" w:noHBand="0" w:noVBand="1"/>
-      </w:tblPr>
-      <w:tblGrid>
-        <w:gridCol w:w="681"/>
-        <w:gridCol w:w="690"/>
-        <w:gridCol w:w="690"/>
-        <w:gridCol w:w="690"/>
-        <w:gridCol w:w="698"/>
-        <w:gridCol w:w="942"/>
-      </w:tblGrid>
-      <w:tr>
-        <w:trPr>
-          <w:jc w:val="center"/>
-        </w:trPr>
-        <w:tc>
-          <w:tcPr>
-            <w:tcW w:w="0" w:type="auto"/>
-            <w:tcBorders>
-              <w:left w:val="nil"/>
-              <w:bottom w:val="nil"/>
-              <w:right w:val="single" w:sz="4" w:space="0" w:color="auto"/>
-            </w:tcBorders>
-          </w:tcPr>
-          <w:p>
-            <w:pPr>
-              <w:spacing w:before="120" w:after="120"/>
-              <w:rPr>
-                <w:rFonts w:asciiTheme="minorHAnsi" w:hAnsiTheme="minorHAnsi" w:cs="Arial"/>
-                <w:sz w:val="20"/>
-                <w:szCs w:val="20"/>
-              </w:rPr>
-            </w:pPr>
-          </w:p>
-        </w:tc>
-        <w:tc>
-          <w:tcPr>
-            <w:tcW w:w="0" w:type="auto"/>
-            <w:gridSpan w:val="4"/>
-            <w:tcBorders>
-              <w:left w:val="single" w:sz="4" w:space="0" w:color="auto"/>
-              <w:bottom w:val="nil"/>
-              <w:right w:val="single" w:sz="4" w:space="0" w:color="auto"/>
-            </w:tcBorders>
-          </w:tcPr>
-          <w:p>
-            <w:pPr>
-              <w:spacing w:before="120" w:after="120"/>
-              <w:rPr>
-                <w:rFonts w:asciiTheme="minorHAnsi" w:hAnsiTheme="minorHAnsi" w:cs="Arial"/>
-                <w:sz w:val="20"/>
-                <w:szCs w:val="20"/>
-              </w:rPr>
-            </w:pPr>
-            <w:r>
-              <w:rPr>
-                <w:rFonts w:asciiTheme="minorHAnsi" w:hAnsiTheme="minorHAnsi" w:cs="Arial"/>
-                <w:b/>
-                <w:sz w:val="20"/>
-                <w:szCs w:val="20"/>
-              </w:rPr>
-              <w:t>Runtime / s</w:t>
-            </w:r>
-          </w:p>
-        </w:tc>
-        <w:tc>
-          <w:tcPr>
-            <w:tcW w:w="0" w:type="auto"/>
-            <w:tcBorders>
-              <w:left w:val="single" w:sz="4" w:space="0" w:color="auto"/>
-              <w:bottom w:val="nil"/>
-              <w:right w:val="nil"/>
-            </w:tcBorders>
-          </w:tcPr>
-          <w:p>
-            <w:pPr>
-              <w:spacing w:before="120" w:after="120"/>
-              <w:rPr>
-                <w:rFonts w:asciiTheme="minorHAnsi" w:hAnsiTheme="minorHAnsi" w:cs="Arial"/>
-                <w:sz w:val="20"/>
-                <w:szCs w:val="20"/>
-              </w:rPr>
-            </w:pPr>
-          </w:p>
-        </w:tc>
-      </w:tr>
-      <w:tr>
-        <w:trPr>
-          <w:jc w:val="center"/>
-        </w:trPr>
-        <w:tc>
-          <w:tcPr>
-            <w:tcW w:w="0" w:type="auto"/>
-            <w:tcBorders>
-              <w:top w:val="nil"/>
-              <w:left w:val="nil"/>
-              <w:bottom w:val="single" w:sz="4" w:space="0" w:color="auto"/>
-              <w:right w:val="single" w:sz="4" w:space="0" w:color="auto"/>
-            </w:tcBorders>
-          </w:tcPr>
-          <w:p>
-            <w:pPr>
-              <w:spacing w:before="120" w:after="120"/>
-              <w:rPr>
-                <w:rFonts w:asciiTheme="minorHAnsi" w:hAnsiTheme="minorHAnsi" w:cs="Arial"/>
-                <w:b/>
-                <w:sz w:val="20"/>
-                <w:szCs w:val="20"/>
-              </w:rPr>
-            </w:pPr>
-            <w:r>
-              <w:rPr>
-                <w:rFonts w:asciiTheme="minorHAnsi" w:hAnsiTheme="minorHAnsi" w:cs="Arial"/>
-                <w:b/>
-                <w:sz w:val="20"/>
-                <w:szCs w:val="20"/>
-              </w:rPr>
-              <w:t>Cores</w:t>
-            </w:r>
-          </w:p>
-        </w:tc>
-        <w:tc>
-          <w:tcPr>
-            <w:tcW w:w="0" w:type="auto"/>
-            <w:tcBorders>
-              <w:top w:val="nil"/>
-              <w:left w:val="single" w:sz="4" w:space="0" w:color="auto"/>
-              <w:bottom w:val="single" w:sz="4" w:space="0" w:color="auto"/>
-              <w:right w:val="nil"/>
-            </w:tcBorders>
-          </w:tcPr>
-          <w:p>
-            <w:pPr>
-              <w:spacing w:before="120" w:after="120"/>
-              <w:jc w:val="right"/>
-              <w:rPr>
-                <w:rFonts w:asciiTheme="minorHAnsi" w:hAnsiTheme="minorHAnsi" w:cs="Arial"/>
-                <w:b/>
-                <w:sz w:val="20"/>
-                <w:szCs w:val="20"/>
-              </w:rPr>
-            </w:pPr>
-            <w:r>
-              <w:rPr>
-                <w:rFonts w:asciiTheme="minorHAnsi" w:hAnsiTheme="minorHAnsi" w:cs="Arial"/>
-                <w:b/>
-                <w:sz w:val="20"/>
-                <w:szCs w:val="20"/>
-              </w:rPr>
-              <w:t>Run 1</w:t>
-            </w:r>
-          </w:p>
-        </w:tc>
-        <w:tc>
-          <w:tcPr>
-            <w:tcW w:w="0" w:type="auto"/>
-            <w:tcBorders>
-              <w:top w:val="nil"/>
-              <w:left w:val="nil"/>
-              <w:bottom w:val="single" w:sz="4" w:space="0" w:color="auto"/>
-              <w:right w:val="nil"/>
-            </w:tcBorders>
-          </w:tcPr>
-          <w:p>
-            <w:pPr>
-              <w:spacing w:before="120" w:after="120"/>
-              <w:jc w:val="right"/>
-              <w:rPr>
-                <w:rFonts w:asciiTheme="minorHAnsi" w:hAnsiTheme="minorHAnsi" w:cs="Arial"/>
-                <w:b/>
-                <w:sz w:val="20"/>
-                <w:szCs w:val="20"/>
-              </w:rPr>
-            </w:pPr>
-            <w:r>
-              <w:rPr>
-                <w:rFonts w:asciiTheme="minorHAnsi" w:hAnsiTheme="minorHAnsi" w:cs="Arial"/>
-                <w:b/>
-                <w:sz w:val="20"/>
-                <w:szCs w:val="20"/>
-              </w:rPr>
-              <w:t xml:space="preserve">Run 2 </w:t>
-            </w:r>
-          </w:p>
-        </w:tc>
-        <w:tc>
-          <w:tcPr>
-            <w:tcW w:w="0" w:type="auto"/>
-            <w:tcBorders>
-              <w:top w:val="nil"/>
-              <w:left w:val="nil"/>
-              <w:bottom w:val="single" w:sz="4" w:space="0" w:color="auto"/>
-              <w:right w:val="nil"/>
-            </w:tcBorders>
-          </w:tcPr>
-          <w:p>
-            <w:pPr>
-              <w:spacing w:before="120" w:after="120"/>
-              <w:jc w:val="right"/>
-              <w:rPr>
-                <w:rFonts w:asciiTheme="minorHAnsi" w:hAnsiTheme="minorHAnsi" w:cs="Arial"/>
-                <w:b/>
-                <w:sz w:val="20"/>
-                <w:szCs w:val="20"/>
-              </w:rPr>
-            </w:pPr>
-            <w:r>
-              <w:rPr>
-                <w:rFonts w:asciiTheme="minorHAnsi" w:hAnsiTheme="minorHAnsi" w:cs="Arial"/>
-                <w:b/>
-                <w:sz w:val="20"/>
-                <w:szCs w:val="20"/>
-              </w:rPr>
-              <w:t>Run 3</w:t>
-            </w:r>
-          </w:p>
-        </w:tc>
-        <w:tc>
-          <w:tcPr>
-            <w:tcW w:w="0" w:type="auto"/>
-            <w:tcBorders>
-              <w:top w:val="nil"/>
-              <w:left w:val="nil"/>
-              <w:bottom w:val="single" w:sz="4" w:space="0" w:color="auto"/>
-              <w:right w:val="single" w:sz="4" w:space="0" w:color="auto"/>
-            </w:tcBorders>
-          </w:tcPr>
-          <w:p>
-            <w:pPr>
-              <w:spacing w:before="120" w:after="120"/>
-              <w:jc w:val="right"/>
-              <w:rPr>
-                <w:rFonts w:asciiTheme="minorHAnsi" w:hAnsiTheme="minorHAnsi" w:cs="Arial"/>
-                <w:b/>
-                <w:sz w:val="20"/>
-                <w:szCs w:val="20"/>
-              </w:rPr>
-            </w:pPr>
-            <w:r>
-              <w:rPr>
-                <w:rFonts w:asciiTheme="minorHAnsi" w:hAnsiTheme="minorHAnsi" w:cs="Arial"/>
-                <w:b/>
-                <w:sz w:val="20"/>
-                <w:szCs w:val="20"/>
-              </w:rPr>
-              <w:t>Mean</w:t>
-            </w:r>
-          </w:p>
-        </w:tc>
-        <w:tc>
-          <w:tcPr>
-            <w:tcW w:w="0" w:type="auto"/>
-            <w:tcBorders>
-              <w:top w:val="nil"/>
-              <w:left w:val="single" w:sz="4" w:space="0" w:color="auto"/>
-              <w:bottom w:val="single" w:sz="4" w:space="0" w:color="auto"/>
-              <w:right w:val="nil"/>
-            </w:tcBorders>
-          </w:tcPr>
-          <w:p>
-            <w:pPr>
-              <w:spacing w:before="120" w:after="120"/>
-              <w:jc w:val="right"/>
-              <w:rPr>
-                <w:rFonts w:asciiTheme="minorHAnsi" w:hAnsiTheme="minorHAnsi" w:cs="Arial"/>
-                <w:b/>
-                <w:sz w:val="20"/>
-                <w:szCs w:val="20"/>
-              </w:rPr>
-            </w:pPr>
-            <w:r>
-              <w:rPr>
-                <w:rFonts w:asciiTheme="minorHAnsi" w:hAnsiTheme="minorHAnsi" w:cs="Arial"/>
-                <w:b/>
-                <w:sz w:val="20"/>
-                <w:szCs w:val="20"/>
-              </w:rPr>
-              <w:t>Speedup</w:t>
-            </w:r>
-          </w:p>
-        </w:tc>
-      </w:tr>
-      <w:tr>
-        <w:trPr>
-          <w:jc w:val="center"/>
-        </w:trPr>
-        <w:tc>
-          <w:tcPr>
-            <w:tcW w:w="0" w:type="auto"/>
-            <w:tcBorders>
-              <w:top w:val="single" w:sz="4" w:space="0" w:color="auto"/>
-              <w:left w:val="nil"/>
-              <w:bottom w:val="nil"/>
-              <w:right w:val="single" w:sz="4" w:space="0" w:color="auto"/>
-            </w:tcBorders>
-          </w:tcPr>
-          <w:p>
-            <w:pPr>
-              <w:spacing w:before="120" w:after="120"/>
-              <w:jc w:val="right"/>
-              <w:rPr>
-                <w:rFonts w:asciiTheme="minorHAnsi" w:hAnsiTheme="minorHAnsi" w:cs="Arial"/>
-                <w:b/>
-                <w:sz w:val="20"/>
-                <w:szCs w:val="20"/>
-              </w:rPr>
-            </w:pPr>
-            <w:r>
-              <w:rPr>
-                <w:rFonts w:asciiTheme="minorHAnsi" w:hAnsiTheme="minorHAnsi" w:cs="Arial"/>
-                <w:b/>
-                <w:sz w:val="20"/>
-                <w:szCs w:val="20"/>
-              </w:rPr>
-              <w:t>96</w:t>
-            </w:r>
-          </w:p>
-        </w:tc>
-        <w:tc>
-          <w:tcPr>
-            <w:tcW w:w="0" w:type="auto"/>
-            <w:tcBorders>
-              <w:top w:val="single" w:sz="4" w:space="0" w:color="auto"/>
-              <w:left w:val="single" w:sz="4" w:space="0" w:color="auto"/>
-              <w:bottom w:val="nil"/>
-              <w:right w:val="nil"/>
-            </w:tcBorders>
-          </w:tcPr>
-          <w:p>
-            <w:pPr>
-              <w:spacing w:before="120" w:after="120"/>
-              <w:jc w:val="right"/>
-              <w:rPr>
-                <w:rFonts w:asciiTheme="minorHAnsi" w:hAnsiTheme="minorHAnsi" w:cs="Arial"/>
-                <w:sz w:val="20"/>
-                <w:szCs w:val="20"/>
-              </w:rPr>
-            </w:pPr>
-            <w:r>
-              <w:rPr>
-                <w:rFonts w:asciiTheme="minorHAnsi" w:hAnsiTheme="minorHAnsi" w:cs="Arial"/>
-                <w:sz w:val="20"/>
-                <w:szCs w:val="20"/>
-              </w:rPr>
-              <w:t>625.7</w:t>
-            </w:r>
-          </w:p>
-        </w:tc>
-        <w:tc>
-          <w:tcPr>
-            <w:tcW w:w="0" w:type="auto"/>
-            <w:tcBorders>
-              <w:top w:val="single" w:sz="4" w:space="0" w:color="auto"/>
-              <w:left w:val="nil"/>
-              <w:bottom w:val="nil"/>
-              <w:right w:val="nil"/>
-            </w:tcBorders>
-          </w:tcPr>
-          <w:p>
-            <w:pPr>
-              <w:spacing w:before="120" w:after="120"/>
-              <w:jc w:val="right"/>
-              <w:rPr>
-                <w:rFonts w:asciiTheme="minorHAnsi" w:hAnsiTheme="minorHAnsi" w:cs="Arial"/>
-                <w:sz w:val="20"/>
-                <w:szCs w:val="20"/>
-              </w:rPr>
-            </w:pPr>
-            <w:r>
-              <w:rPr>
-                <w:rFonts w:asciiTheme="minorHAnsi" w:hAnsiTheme="minorHAnsi" w:cs="Arial"/>
-                <w:sz w:val="20"/>
-                <w:szCs w:val="20"/>
-              </w:rPr>
-              <w:t>613.4</w:t>
-            </w:r>
-          </w:p>
-        </w:tc>
-        <w:tc>
-          <w:tcPr>
-            <w:tcW w:w="0" w:type="auto"/>
-            <w:tcBorders>
-              <w:top w:val="single" w:sz="4" w:space="0" w:color="auto"/>
-              <w:left w:val="nil"/>
-              <w:bottom w:val="nil"/>
-              <w:right w:val="nil"/>
-            </w:tcBorders>
-          </w:tcPr>
-          <w:p>
-            <w:pPr>
-              <w:spacing w:before="120" w:after="120"/>
-              <w:jc w:val="right"/>
-              <w:rPr>
-                <w:rFonts w:asciiTheme="minorHAnsi" w:hAnsiTheme="minorHAnsi" w:cs="Arial"/>
-                <w:sz w:val="20"/>
-                <w:szCs w:val="20"/>
-              </w:rPr>
-            </w:pPr>
-            <w:r>
-              <w:rPr>
-                <w:rFonts w:asciiTheme="minorHAnsi" w:hAnsiTheme="minorHAnsi" w:cs="Arial"/>
-                <w:sz w:val="20"/>
-                <w:szCs w:val="20"/>
-              </w:rPr>
-              <w:t>634.6</w:t>
-            </w:r>
-          </w:p>
-        </w:tc>
-        <w:tc>
-          <w:tcPr>
-            <w:tcW w:w="0" w:type="auto"/>
-            <w:tcBorders>
-              <w:top w:val="single" w:sz="4" w:space="0" w:color="auto"/>
-              <w:left w:val="nil"/>
-              <w:bottom w:val="nil"/>
-              <w:right w:val="single" w:sz="4" w:space="0" w:color="auto"/>
-            </w:tcBorders>
-          </w:tcPr>
-          <w:p>
-            <w:pPr>
-              <w:spacing w:before="120" w:after="120"/>
-              <w:jc w:val="right"/>
-              <w:rPr>
-                <w:rFonts w:asciiTheme="minorHAnsi" w:hAnsiTheme="minorHAnsi" w:cs="Arial"/>
-                <w:sz w:val="20"/>
-                <w:szCs w:val="20"/>
-              </w:rPr>
-            </w:pPr>
-            <w:r>
-              <w:rPr>
-                <w:rFonts w:asciiTheme="minorHAnsi" w:hAnsiTheme="minorHAnsi" w:cs="Arial"/>
-                <w:sz w:val="20"/>
-                <w:szCs w:val="20"/>
-              </w:rPr>
-              <w:t>624.6</w:t>
-            </w:r>
-          </w:p>
-        </w:tc>
-        <w:tc>
-          <w:tcPr>
-            <w:tcW w:w="0" w:type="auto"/>
-            <w:tcBorders>
-              <w:top w:val="single" w:sz="4" w:space="0" w:color="auto"/>
-              <w:left w:val="single" w:sz="4" w:space="0" w:color="auto"/>
-              <w:bottom w:val="nil"/>
-              <w:right w:val="nil"/>
-            </w:tcBorders>
-          </w:tcPr>
-          <w:p>
-            <w:pPr>
-              <w:spacing w:before="120" w:after="120"/>
-              <w:jc w:val="right"/>
-              <w:rPr>
-                <w:rFonts w:asciiTheme="minorHAnsi" w:hAnsiTheme="minorHAnsi" w:cs="Arial"/>
-                <w:sz w:val="20"/>
-                <w:szCs w:val="20"/>
-              </w:rPr>
-            </w:pPr>
-            <w:r>
-              <w:rPr>
-                <w:rFonts w:asciiTheme="minorHAnsi" w:hAnsiTheme="minorHAnsi" w:cs="Arial"/>
-                <w:sz w:val="20"/>
-                <w:szCs w:val="20"/>
-              </w:rPr>
-              <w:t>1.00</w:t>
-            </w:r>
-          </w:p>
-        </w:tc>
-      </w:tr>
-      <w:tr>
-        <w:trPr>
-          <w:jc w:val="center"/>
-        </w:trPr>
-        <w:tc>
-          <w:tcPr>
-            <w:tcW w:w="0" w:type="auto"/>
-            <w:tcBorders>
-              <w:top w:val="nil"/>
-              <w:left w:val="nil"/>
-              <w:bottom w:val="nil"/>
-              <w:right w:val="single" w:sz="4" w:space="0" w:color="auto"/>
-            </w:tcBorders>
-          </w:tcPr>
-          <w:p>
-            <w:pPr>
-              <w:spacing w:before="120" w:after="120"/>
-              <w:jc w:val="right"/>
-              <w:rPr>
-                <w:rFonts w:asciiTheme="minorHAnsi" w:hAnsiTheme="minorHAnsi" w:cs="Arial"/>
-                <w:b/>
-                <w:sz w:val="20"/>
-                <w:szCs w:val="20"/>
-              </w:rPr>
-            </w:pPr>
-            <w:r>
-              <w:rPr>
-                <w:rFonts w:asciiTheme="minorHAnsi" w:hAnsiTheme="minorHAnsi" w:cs="Arial"/>
-                <w:b/>
-                <w:sz w:val="20"/>
-                <w:szCs w:val="20"/>
-              </w:rPr>
-              <w:t>192</w:t>
-            </w:r>
-          </w:p>
-        </w:tc>
-        <w:tc>
-          <w:tcPr>
-            <w:tcW w:w="0" w:type="auto"/>
-            <w:tcBorders>
-              <w:top w:val="nil"/>
-              <w:left w:val="single" w:sz="4" w:space="0" w:color="auto"/>
-              <w:bottom w:val="nil"/>
-              <w:right w:val="nil"/>
-            </w:tcBorders>
-          </w:tcPr>
-          <w:p>
-            <w:pPr>
-              <w:spacing w:before="120" w:after="120"/>
-              <w:jc w:val="right"/>
-              <w:rPr>
-                <w:rFonts w:asciiTheme="minorHAnsi" w:hAnsiTheme="minorHAnsi" w:cs="Arial"/>
-                <w:sz w:val="20"/>
-                <w:szCs w:val="20"/>
-              </w:rPr>
-            </w:pPr>
-            <w:r>
-              <w:rPr>
-                <w:rFonts w:asciiTheme="minorHAnsi" w:hAnsiTheme="minorHAnsi" w:cs="Arial"/>
-                <w:sz w:val="20"/>
-                <w:szCs w:val="20"/>
-              </w:rPr>
-              <w:t>318.5</w:t>
-            </w:r>
-          </w:p>
-        </w:tc>
-        <w:tc>
-          <w:tcPr>
-            <w:tcW w:w="0" w:type="auto"/>
-            <w:tcBorders>
-              <w:top w:val="nil"/>
-              <w:left w:val="nil"/>
-              <w:bottom w:val="nil"/>
-              <w:right w:val="nil"/>
-            </w:tcBorders>
-          </w:tcPr>
-          <w:p>
-            <w:pPr>
-              <w:spacing w:before="120" w:after="120"/>
-              <w:jc w:val="right"/>
-              <w:rPr>
-                <w:rFonts w:asciiTheme="minorHAnsi" w:hAnsiTheme="minorHAnsi" w:cs="Arial"/>
-                <w:sz w:val="20"/>
-                <w:szCs w:val="20"/>
-              </w:rPr>
-            </w:pPr>
-            <w:r>
-              <w:rPr>
-                <w:rFonts w:asciiTheme="minorHAnsi" w:hAnsiTheme="minorHAnsi" w:cs="Arial"/>
-                <w:sz w:val="20"/>
-                <w:szCs w:val="20"/>
-              </w:rPr>
-              <w:t>312.5</w:t>
-            </w:r>
-          </w:p>
-        </w:tc>
-        <w:tc>
-          <w:tcPr>
-            <w:tcW w:w="0" w:type="auto"/>
-            <w:tcBorders>
-              <w:top w:val="nil"/>
-              <w:left w:val="nil"/>
-              <w:bottom w:val="nil"/>
-              <w:right w:val="nil"/>
-            </w:tcBorders>
-          </w:tcPr>
-          <w:p>
-            <w:pPr>
-              <w:spacing w:before="120" w:after="120"/>
-              <w:jc w:val="right"/>
-              <w:rPr>
-                <w:rFonts w:asciiTheme="minorHAnsi" w:hAnsiTheme="minorHAnsi" w:cs="Arial"/>
-                <w:sz w:val="20"/>
-                <w:szCs w:val="20"/>
-              </w:rPr>
-            </w:pPr>
-            <w:r>
-              <w:rPr>
-                <w:rFonts w:asciiTheme="minorHAnsi" w:hAnsiTheme="minorHAnsi" w:cs="Arial"/>
-                <w:sz w:val="20"/>
-                <w:szCs w:val="20"/>
-              </w:rPr>
-              <w:t>323.1</w:t>
-            </w:r>
-          </w:p>
-        </w:tc>
-        <w:tc>
-          <w:tcPr>
-            <w:tcW w:w="0" w:type="auto"/>
-            <w:tcBorders>
-              <w:top w:val="nil"/>
-              <w:left w:val="nil"/>
-              <w:bottom w:val="nil"/>
-              <w:right w:val="single" w:sz="4" w:space="0" w:color="auto"/>
-            </w:tcBorders>
-          </w:tcPr>
-          <w:p>
-            <w:pPr>
-              <w:spacing w:before="120" w:after="120"/>
-              <w:jc w:val="right"/>
-              <w:rPr>
-                <w:rFonts w:asciiTheme="minorHAnsi" w:hAnsiTheme="minorHAnsi" w:cs="Arial"/>
-                <w:sz w:val="20"/>
-                <w:szCs w:val="20"/>
-              </w:rPr>
-            </w:pPr>
-            <w:r>
-              <w:rPr>
-                <w:rFonts w:asciiTheme="minorHAnsi" w:hAnsiTheme="minorHAnsi" w:cs="Arial"/>
-                <w:sz w:val="20"/>
-                <w:szCs w:val="20"/>
-              </w:rPr>
-              <w:t>318.0</w:t>
-            </w:r>
-          </w:p>
-        </w:tc>
-        <w:tc>
-          <w:tcPr>
-            <w:tcW w:w="0" w:type="auto"/>
-            <w:tcBorders>
-              <w:top w:val="nil"/>
-              <w:left w:val="single" w:sz="4" w:space="0" w:color="auto"/>
-              <w:bottom w:val="nil"/>
-              <w:right w:val="nil"/>
-            </w:tcBorders>
-          </w:tcPr>
-          <w:p>
-            <w:pPr>
-              <w:spacing w:before="120" w:after="120"/>
-              <w:jc w:val="right"/>
-              <w:rPr>
-                <w:rFonts w:asciiTheme="minorHAnsi" w:hAnsiTheme="minorHAnsi" w:cs="Arial"/>
-                <w:sz w:val="20"/>
-                <w:szCs w:val="20"/>
-              </w:rPr>
-            </w:pPr>
-            <w:r>
-              <w:rPr>
-                <w:rFonts w:asciiTheme="minorHAnsi" w:hAnsiTheme="minorHAnsi" w:cs="Arial"/>
-                <w:sz w:val="20"/>
-                <w:szCs w:val="20"/>
-              </w:rPr>
-              <w:t>1.96</w:t>
-            </w:r>
-          </w:p>
-        </w:tc>
-      </w:tr>
-      <w:tr>
-        <w:trPr>
-          <w:jc w:val="center"/>
-        </w:trPr>
-        <w:tc>
-          <w:tcPr>
-            <w:tcW w:w="0" w:type="auto"/>
-            <w:tcBorders>
-              <w:top w:val="nil"/>
-              <w:left w:val="nil"/>
-              <w:bottom w:val="nil"/>
-              <w:right w:val="single" w:sz="4" w:space="0" w:color="auto"/>
-            </w:tcBorders>
-          </w:tcPr>
-          <w:p>
-            <w:pPr>
-              <w:spacing w:before="120" w:after="120"/>
-              <w:jc w:val="right"/>
-              <w:rPr>
-                <w:rFonts w:asciiTheme="minorHAnsi" w:hAnsiTheme="minorHAnsi" w:cs="Arial"/>
-                <w:b/>
-                <w:sz w:val="20"/>
-                <w:szCs w:val="20"/>
-              </w:rPr>
-            </w:pPr>
-            <w:r>
-              <w:rPr>
-                <w:rFonts w:asciiTheme="minorHAnsi" w:hAnsiTheme="minorHAnsi" w:cs="Arial"/>
-                <w:b/>
-                <w:sz w:val="20"/>
-                <w:szCs w:val="20"/>
-              </w:rPr>
-              <w:t>384</w:t>
-            </w:r>
-          </w:p>
-        </w:tc>
-        <w:tc>
-          <w:tcPr>
-            <w:tcW w:w="0" w:type="auto"/>
-            <w:tcBorders>
-              <w:top w:val="nil"/>
-              <w:left w:val="single" w:sz="4" w:space="0" w:color="auto"/>
-              <w:bottom w:val="nil"/>
-              <w:right w:val="nil"/>
-            </w:tcBorders>
-          </w:tcPr>
-          <w:p>
-            <w:pPr>
-              <w:spacing w:before="120" w:after="120"/>
-              <w:jc w:val="right"/>
-              <w:rPr>
-                <w:rFonts w:asciiTheme="minorHAnsi" w:hAnsiTheme="minorHAnsi" w:cs="Arial"/>
-                <w:sz w:val="20"/>
-                <w:szCs w:val="20"/>
-              </w:rPr>
-            </w:pPr>
-            <w:r>
-              <w:rPr>
-                <w:rFonts w:asciiTheme="minorHAnsi" w:hAnsiTheme="minorHAnsi" w:cs="Arial"/>
-                <w:sz w:val="20"/>
-                <w:szCs w:val="20"/>
-              </w:rPr>
-              <w:t>159.7</w:t>
-            </w:r>
-          </w:p>
-        </w:tc>
-        <w:tc>
-          <w:tcPr>
-            <w:tcW w:w="0" w:type="auto"/>
-            <w:tcBorders>
-              <w:top w:val="nil"/>
-              <w:left w:val="nil"/>
-              <w:bottom w:val="nil"/>
-              <w:right w:val="nil"/>
-            </w:tcBorders>
-          </w:tcPr>
-          <w:p>
-            <w:pPr>
-              <w:spacing w:before="120" w:after="120"/>
-              <w:jc w:val="right"/>
-              <w:rPr>
-                <w:rFonts w:asciiTheme="minorHAnsi" w:hAnsiTheme="minorHAnsi" w:cs="Arial"/>
-                <w:sz w:val="20"/>
-                <w:szCs w:val="20"/>
-              </w:rPr>
-            </w:pPr>
-            <w:r>
-              <w:rPr>
-                <w:rFonts w:asciiTheme="minorHAnsi" w:hAnsiTheme="minorHAnsi" w:cs="Arial"/>
-                <w:sz w:val="20"/>
-                <w:szCs w:val="20"/>
-              </w:rPr>
-              <w:t>161.2</w:t>
-            </w:r>
-          </w:p>
-        </w:tc>
-        <w:tc>
-          <w:tcPr>
-            <w:tcW w:w="0" w:type="auto"/>
-            <w:tcBorders>
-              <w:top w:val="nil"/>
-              <w:left w:val="nil"/>
-              <w:bottom w:val="nil"/>
-              <w:right w:val="nil"/>
-            </w:tcBorders>
-          </w:tcPr>
-          <w:p>
-            <w:pPr>
-              <w:spacing w:before="120" w:after="120"/>
-              <w:jc w:val="right"/>
-              <w:rPr>
-                <w:rFonts w:asciiTheme="minorHAnsi" w:hAnsiTheme="minorHAnsi" w:cs="Arial"/>
-                <w:sz w:val="20"/>
-                <w:szCs w:val="20"/>
-              </w:rPr>
-            </w:pPr>
-            <w:r>
-              <w:rPr>
-                <w:rFonts w:asciiTheme="minorHAnsi" w:hAnsiTheme="minorHAnsi" w:cs="Arial"/>
-                <w:sz w:val="20"/>
-                <w:szCs w:val="20"/>
-              </w:rPr>
-              <w:t>157.4</w:t>
-            </w:r>
-          </w:p>
-        </w:tc>
-        <w:tc>
-          <w:tcPr>
-            <w:tcW w:w="0" w:type="auto"/>
-            <w:tcBorders>
-              <w:top w:val="nil"/>
-              <w:left w:val="nil"/>
-              <w:bottom w:val="nil"/>
-              <w:right w:val="single" w:sz="4" w:space="0" w:color="auto"/>
-            </w:tcBorders>
-          </w:tcPr>
-          <w:p>
-            <w:pPr>
-              <w:spacing w:before="120" w:after="120"/>
-              <w:jc w:val="right"/>
-              <w:rPr>
-                <w:rFonts w:asciiTheme="minorHAnsi" w:hAnsiTheme="minorHAnsi" w:cs="Arial"/>
-                <w:sz w:val="20"/>
-                <w:szCs w:val="20"/>
-              </w:rPr>
-            </w:pPr>
-            <w:r>
-              <w:rPr>
-                <w:rFonts w:asciiTheme="minorHAnsi" w:hAnsiTheme="minorHAnsi" w:cs="Arial"/>
-                <w:sz w:val="20"/>
-                <w:szCs w:val="20"/>
-              </w:rPr>
-              <w:t>159.4</w:t>
-            </w:r>
-          </w:p>
-        </w:tc>
-        <w:tc>
-          <w:tcPr>
-            <w:tcW w:w="0" w:type="auto"/>
-            <w:tcBorders>
-              <w:top w:val="nil"/>
-              <w:left w:val="single" w:sz="4" w:space="0" w:color="auto"/>
-              <w:bottom w:val="nil"/>
-              <w:right w:val="nil"/>
-            </w:tcBorders>
-          </w:tcPr>
-          <w:p>
-            <w:pPr>
-              <w:spacing w:before="120" w:after="120"/>
-              <w:jc w:val="right"/>
-              <w:rPr>
-                <w:rFonts w:asciiTheme="minorHAnsi" w:hAnsiTheme="minorHAnsi" w:cs="Arial"/>
-                <w:sz w:val="20"/>
-                <w:szCs w:val="20"/>
-              </w:rPr>
-            </w:pPr>
-            <w:r>
-              <w:rPr>
-                <w:rFonts w:asciiTheme="minorHAnsi" w:hAnsiTheme="minorHAnsi" w:cs="Arial"/>
-                <w:sz w:val="20"/>
-                <w:szCs w:val="20"/>
-              </w:rPr>
-              <w:t>3.92</w:t>
-            </w:r>
-          </w:p>
-        </w:tc>
-      </w:tr>
-      <w:tr>
-        <w:trPr>
-          <w:jc w:val="center"/>
-        </w:trPr>
-        <w:tc>
-          <w:tcPr>
-            <w:tcW w:w="0" w:type="auto"/>
-            <w:tcBorders>
-              <w:top w:val="nil"/>
-              <w:left w:val="nil"/>
-              <w:bottom w:val="nil"/>
-              <w:right w:val="single" w:sz="4" w:space="0" w:color="auto"/>
-            </w:tcBorders>
-          </w:tcPr>
-          <w:p>
-            <w:pPr>
-              <w:spacing w:before="120" w:after="120"/>
-              <w:jc w:val="right"/>
-              <w:rPr>
-                <w:rFonts w:asciiTheme="minorHAnsi" w:hAnsiTheme="minorHAnsi" w:cs="Arial"/>
-                <w:b/>
-                <w:sz w:val="20"/>
-                <w:szCs w:val="20"/>
-              </w:rPr>
-            </w:pPr>
-            <w:r>
-              <w:rPr>
-                <w:rFonts w:asciiTheme="minorHAnsi" w:hAnsiTheme="minorHAnsi" w:cs="Arial"/>
-                <w:b/>
-                <w:sz w:val="20"/>
-                <w:szCs w:val="20"/>
-              </w:rPr>
-              <w:t>768</w:t>
-            </w:r>
-          </w:p>
-        </w:tc>
-        <w:tc>
-          <w:tcPr>
-            <w:tcW w:w="0" w:type="auto"/>
-            <w:tcBorders>
-              <w:top w:val="nil"/>
-              <w:left w:val="single" w:sz="4" w:space="0" w:color="auto"/>
-              <w:bottom w:val="nil"/>
-              <w:right w:val="nil"/>
-            </w:tcBorders>
-          </w:tcPr>
-          <w:p>
-            <w:pPr>
-              <w:spacing w:before="120" w:after="120"/>
-              <w:jc w:val="right"/>
-              <w:rPr>
-                <w:rFonts w:asciiTheme="minorHAnsi" w:hAnsiTheme="minorHAnsi" w:cs="Arial"/>
-                <w:sz w:val="20"/>
-                <w:szCs w:val="20"/>
-              </w:rPr>
-            </w:pPr>
-            <w:r>
-              <w:rPr>
-                <w:rFonts w:asciiTheme="minorHAnsi" w:hAnsiTheme="minorHAnsi" w:cs="Arial"/>
-                <w:sz w:val="20"/>
-                <w:szCs w:val="20"/>
-              </w:rPr>
-              <w:t>81.2</w:t>
-            </w:r>
-          </w:p>
-        </w:tc>
-        <w:tc>
-          <w:tcPr>
-            <w:tcW w:w="0" w:type="auto"/>
-            <w:tcBorders>
-              <w:top w:val="nil"/>
-              <w:left w:val="nil"/>
-              <w:bottom w:val="nil"/>
-              <w:right w:val="nil"/>
-            </w:tcBorders>
-          </w:tcPr>
-          <w:p>
-            <w:pPr>
-              <w:spacing w:before="120" w:after="120"/>
-              <w:jc w:val="right"/>
-              <w:rPr>
-                <w:rFonts w:asciiTheme="minorHAnsi" w:hAnsiTheme="minorHAnsi" w:cs="Arial"/>
-                <w:sz w:val="20"/>
-                <w:szCs w:val="20"/>
-              </w:rPr>
-            </w:pPr>
-            <w:r>
-              <w:rPr>
-                <w:rFonts w:asciiTheme="minorHAnsi" w:hAnsiTheme="minorHAnsi" w:cs="Arial"/>
-                <w:sz w:val="20"/>
-                <w:szCs w:val="20"/>
-              </w:rPr>
-              <w:t>81.4</w:t>
-            </w:r>
-          </w:p>
-        </w:tc>
-        <w:tc>
-          <w:tcPr>
-            <w:tcW w:w="0" w:type="auto"/>
-            <w:tcBorders>
-              <w:top w:val="nil"/>
-              <w:left w:val="nil"/>
-              <w:bottom w:val="nil"/>
-              <w:right w:val="nil"/>
-            </w:tcBorders>
-          </w:tcPr>
-          <w:p>
-            <w:pPr>
-              <w:spacing w:before="120" w:after="120"/>
-              <w:jc w:val="right"/>
-              <w:rPr>
-                <w:rFonts w:asciiTheme="minorHAnsi" w:hAnsiTheme="minorHAnsi" w:cs="Arial"/>
-                <w:sz w:val="20"/>
-                <w:szCs w:val="20"/>
-              </w:rPr>
-            </w:pPr>
-            <w:r>
-              <w:rPr>
-                <w:rFonts w:asciiTheme="minorHAnsi" w:hAnsiTheme="minorHAnsi" w:cs="Arial"/>
-                <w:sz w:val="20"/>
-                <w:szCs w:val="20"/>
-              </w:rPr>
-              <w:t>81.1</w:t>
-            </w:r>
-          </w:p>
-        </w:tc>
-        <w:tc>
-          <w:tcPr>
-            <w:tcW w:w="0" w:type="auto"/>
-            <w:tcBorders>
-              <w:top w:val="nil"/>
-              <w:left w:val="nil"/>
-              <w:bottom w:val="nil"/>
-              <w:right w:val="single" w:sz="4" w:space="0" w:color="auto"/>
-            </w:tcBorders>
-          </w:tcPr>
-          <w:p>
-            <w:pPr>
-              <w:spacing w:before="120" w:after="120"/>
-              <w:jc w:val="right"/>
-              <w:rPr>
-                <w:rFonts w:asciiTheme="minorHAnsi" w:hAnsiTheme="minorHAnsi" w:cs="Arial"/>
-                <w:sz w:val="20"/>
-                <w:szCs w:val="20"/>
-              </w:rPr>
-            </w:pPr>
-            <w:r>
-              <w:rPr>
-                <w:rFonts w:asciiTheme="minorHAnsi" w:hAnsiTheme="minorHAnsi" w:cs="Arial"/>
-                <w:sz w:val="20"/>
-                <w:szCs w:val="20"/>
-              </w:rPr>
-              <w:t>81.2</w:t>
-            </w:r>
-          </w:p>
-        </w:tc>
-        <w:tc>
-          <w:tcPr>
-            <w:tcW w:w="0" w:type="auto"/>
-            <w:tcBorders>
-              <w:top w:val="nil"/>
-              <w:left w:val="single" w:sz="4" w:space="0" w:color="auto"/>
-              <w:bottom w:val="nil"/>
-              <w:right w:val="nil"/>
-            </w:tcBorders>
-          </w:tcPr>
-          <w:p>
-            <w:pPr>
-              <w:spacing w:before="120" w:after="120"/>
-              <w:jc w:val="right"/>
-              <w:rPr>
-                <w:rFonts w:asciiTheme="minorHAnsi" w:hAnsiTheme="minorHAnsi" w:cs="Arial"/>
-                <w:sz w:val="20"/>
-                <w:szCs w:val="20"/>
-              </w:rPr>
-            </w:pPr>
-            <w:r>
-              <w:rPr>
-                <w:rFonts w:asciiTheme="minorHAnsi" w:hAnsiTheme="minorHAnsi" w:cs="Arial"/>
-                <w:sz w:val="20"/>
-                <w:szCs w:val="20"/>
-              </w:rPr>
-              <w:t>7.69</w:t>
-            </w:r>
-          </w:p>
-        </w:tc>
-      </w:tr>
-      <w:tr>
-        <w:trPr>
-          <w:jc w:val="center"/>
-        </w:trPr>
-        <w:tc>
-          <w:tcPr>
-            <w:tcW w:w="0" w:type="auto"/>
-            <w:tcBorders>
-              <w:top w:val="nil"/>
-              <w:left w:val="nil"/>
-              <w:bottom w:val="single" w:sz="4" w:space="0" w:color="auto"/>
-              <w:right w:val="single" w:sz="4" w:space="0" w:color="auto"/>
-            </w:tcBorders>
-          </w:tcPr>
-          <w:p>
-            <w:pPr>
-              <w:spacing w:before="120" w:after="120"/>
-              <w:jc w:val="right"/>
-              <w:rPr>
-                <w:rFonts w:asciiTheme="minorHAnsi" w:hAnsiTheme="minorHAnsi" w:cs="Arial"/>
-                <w:b/>
-                <w:sz w:val="20"/>
-                <w:szCs w:val="20"/>
-              </w:rPr>
-            </w:pPr>
-            <w:r>
-              <w:rPr>
-                <w:rFonts w:asciiTheme="minorHAnsi" w:hAnsiTheme="minorHAnsi" w:cs="Arial"/>
-                <w:b/>
-                <w:sz w:val="20"/>
-                <w:szCs w:val="20"/>
-              </w:rPr>
-              <w:t>1536</w:t>
-            </w:r>
-          </w:p>
-        </w:tc>
-        <w:tc>
-          <w:tcPr>
-            <w:tcW w:w="0" w:type="auto"/>
-            <w:tcBorders>
-              <w:top w:val="nil"/>
-              <w:left w:val="single" w:sz="4" w:space="0" w:color="auto"/>
-              <w:bottom w:val="single" w:sz="4" w:space="0" w:color="auto"/>
-              <w:right w:val="nil"/>
-            </w:tcBorders>
-          </w:tcPr>
-          <w:p>
-            <w:pPr>
-              <w:spacing w:before="120" w:after="120"/>
-              <w:jc w:val="right"/>
-              <w:rPr>
-                <w:rFonts w:asciiTheme="minorHAnsi" w:hAnsiTheme="minorHAnsi" w:cs="Arial"/>
-                <w:sz w:val="20"/>
-                <w:szCs w:val="20"/>
-              </w:rPr>
-            </w:pPr>
-            <w:r>
-              <w:rPr>
-                <w:rFonts w:asciiTheme="minorHAnsi" w:hAnsiTheme="minorHAnsi" w:cs="Arial"/>
-                <w:sz w:val="20"/>
-                <w:szCs w:val="20"/>
-              </w:rPr>
-              <w:t>45.4</w:t>
-            </w:r>
-          </w:p>
-        </w:tc>
-        <w:tc>
-          <w:tcPr>
-            <w:tcW w:w="0" w:type="auto"/>
-            <w:tcBorders>
-              <w:top w:val="nil"/>
-              <w:left w:val="nil"/>
-              <w:bottom w:val="single" w:sz="4" w:space="0" w:color="auto"/>
-              <w:right w:val="nil"/>
-            </w:tcBorders>
-          </w:tcPr>
-          <w:p>
-            <w:pPr>
-              <w:spacing w:before="120" w:after="120"/>
-              <w:jc w:val="right"/>
-              <w:rPr>
-                <w:rFonts w:asciiTheme="minorHAnsi" w:hAnsiTheme="minorHAnsi" w:cs="Arial"/>
-                <w:sz w:val="20"/>
-                <w:szCs w:val="20"/>
-              </w:rPr>
-            </w:pPr>
-            <w:r>
-              <w:rPr>
-                <w:rFonts w:asciiTheme="minorHAnsi" w:hAnsiTheme="minorHAnsi" w:cs="Arial"/>
-                <w:sz w:val="20"/>
-                <w:szCs w:val="20"/>
-              </w:rPr>
-              <w:t>45.0</w:t>
-            </w:r>
-          </w:p>
-        </w:tc>
-        <w:tc>
-          <w:tcPr>
-            <w:tcW w:w="0" w:type="auto"/>
-            <w:tcBorders>
-              <w:top w:val="nil"/>
-              <w:left w:val="nil"/>
-              <w:bottom w:val="single" w:sz="4" w:space="0" w:color="auto"/>
-              <w:right w:val="nil"/>
-            </w:tcBorders>
-          </w:tcPr>
-          <w:p>
-            <w:pPr>
-              <w:spacing w:before="120" w:after="120"/>
-              <w:jc w:val="right"/>
-              <w:rPr>
-                <w:rFonts w:asciiTheme="minorHAnsi" w:hAnsiTheme="minorHAnsi" w:cs="Arial"/>
-                <w:sz w:val="20"/>
-                <w:szCs w:val="20"/>
-              </w:rPr>
-            </w:pPr>
-            <w:r>
-              <w:rPr>
-                <w:rFonts w:asciiTheme="minorHAnsi" w:hAnsiTheme="minorHAnsi" w:cs="Arial"/>
-                <w:sz w:val="20"/>
-                <w:szCs w:val="20"/>
-              </w:rPr>
-              <w:t>46.1</w:t>
-            </w:r>
-          </w:p>
-        </w:tc>
-        <w:tc>
-          <w:tcPr>
-            <w:tcW w:w="0" w:type="auto"/>
-            <w:tcBorders>
-              <w:top w:val="nil"/>
-              <w:left w:val="nil"/>
-              <w:bottom w:val="single" w:sz="4" w:space="0" w:color="auto"/>
-              <w:right w:val="single" w:sz="4" w:space="0" w:color="auto"/>
-            </w:tcBorders>
-          </w:tcPr>
-          <w:p>
-            <w:pPr>
-              <w:spacing w:before="120" w:after="120"/>
-              <w:jc w:val="right"/>
-              <w:rPr>
-                <w:rFonts w:asciiTheme="minorHAnsi" w:hAnsiTheme="minorHAnsi" w:cs="Arial"/>
-                <w:sz w:val="20"/>
-                <w:szCs w:val="20"/>
-              </w:rPr>
-            </w:pPr>
-            <w:r>
-              <w:rPr>
-                <w:rFonts w:asciiTheme="minorHAnsi" w:hAnsiTheme="minorHAnsi" w:cs="Arial"/>
-                <w:sz w:val="20"/>
-                <w:szCs w:val="20"/>
-              </w:rPr>
-              <w:t>45.5</w:t>
-            </w:r>
-          </w:p>
-        </w:tc>
-        <w:tc>
-          <w:tcPr>
-            <w:tcW w:w="0" w:type="auto"/>
-            <w:tcBorders>
-              <w:top w:val="nil"/>
-              <w:left w:val="single" w:sz="4" w:space="0" w:color="auto"/>
-              <w:bottom w:val="single" w:sz="4" w:space="0" w:color="auto"/>
-              <w:right w:val="nil"/>
-            </w:tcBorders>
-          </w:tcPr>
-          <w:p>
-            <w:pPr>
-              <w:spacing w:before="120" w:after="120"/>
-              <w:jc w:val="right"/>
-              <w:rPr>
-                <w:rFonts w:asciiTheme="minorHAnsi" w:hAnsiTheme="minorHAnsi" w:cs="Arial"/>
-                <w:sz w:val="20"/>
-                <w:szCs w:val="20"/>
-              </w:rPr>
-            </w:pPr>
-            <w:r>
-              <w:rPr>
-                <w:rFonts w:asciiTheme="minorHAnsi" w:hAnsiTheme="minorHAnsi" w:cs="Arial"/>
-                <w:sz w:val="20"/>
-                <w:szCs w:val="20"/>
-              </w:rPr>
-              <w:t>13.73</w:t>
-            </w:r>
-          </w:p>
-        </w:tc>
-      </w:tr>
-    </w:tbl>
-    <w:p>
-      <w:pPr>
-        <w:spacing w:before="120" w:after="120"/>
-        <w:rPr>
-          <w:rFonts w:asciiTheme="minorHAnsi" w:hAnsiTheme="minorHAnsi" w:cs="Arial"/>
-        </w:rPr>
-      </w:pPr>
-      <w:r>
-        <w:rPr>
-          <w:rFonts w:asciiTheme="minorHAnsi" w:hAnsiTheme="minorHAnsi" w:cs="Arial"/>
-        </w:rPr>
-        <w:t>Example speedup graph:</w:t>
-      </w:r>
-    </w:p>
-    <w:p>
-      <w:pPr>
-        <w:spacing w:before="120" w:after="120"/>
-        <w:jc w:val="center"/>
-        <w:rPr>
-          <w:rFonts w:asciiTheme="minorHAnsi" w:hAnsiTheme="minorHAnsi" w:cs="Arial"/>
-        </w:rPr>
-      </w:pPr>
-      <w:r>
-        <w:rPr>
-          <w:rFonts w:asciiTheme="minorHAnsi" w:hAnsiTheme="minorHAnsi" w:cs="Arial"/>
-          <w:noProof/>
-          <w:lang w:eastAsia="en-GB"/>
-        </w:rPr>
-        <w:drawing>
-          <wp:inline distT="0" distB="0" distL="0" distR="0" wp14:anchorId="2FF73910" wp14:editId="31A9DE0D">
-            <wp:extent cx="4516687" cy="2541451"/>
-            <wp:effectExtent l="0" t="0" r="5080" b="0"/>
-            <wp:docPr id="3" name="Picture 3"/>
-            <wp:cNvGraphicFramePr>
-              <a:graphicFrameLocks xmlns:a="http://schemas.openxmlformats.org/drawingml/2006/main" noChangeAspect="1"/>
-            </wp:cNvGraphicFramePr>
-            <a:graphic xmlns:a="http://schemas.openxmlformats.org/drawingml/2006/main">
-              <a:graphicData uri="http://schemas.openxmlformats.org/drawingml/2006/picture">
-                <pic:pic xmlns:pic="http://schemas.openxmlformats.org/drawingml/2006/picture">
-                  <pic:nvPicPr>
-                    <pic:cNvPr id="0" name="example_speedup.png"/>
-                    <pic:cNvPicPr/>
-                  </pic:nvPicPr>
-                  <pic:blipFill>
-                    <a:blip r:embed="rId12">
-                      <a:extLst>
-                        <a:ext uri="{28A0092B-C50C-407E-A947-70E740481C1C}">
-                          <a14:useLocalDpi xmlns:a14="http://schemas.microsoft.com/office/drawing/2010/main" val="0"/>
-                        </a:ext>
-                      </a:extLst>
-                    </a:blip>
-                    <a:stretch>
-                      <a:fillRect/>
-                    </a:stretch>
-                  </pic:blipFill>
-                  <pic:spPr>
-                    <a:xfrm>
-                      <a:off x="0" y="0"/>
-                      <a:ext cx="4528995" cy="2548376"/>
-                    </a:xfrm>
-                    <a:prstGeom prst="rect">
-                      <a:avLst/>
-                    </a:prstGeom>
-                  </pic:spPr>
-                </pic:pic>
-              </a:graphicData>
-            </a:graphic>
-          </wp:inline>
-        </w:drawing>
-      </w:r>
-    </w:p>
-    <w:p>
-      <w:pPr>
-        <w:pageBreakBefore/>
-        <w:numPr>
-          <w:ilvl w:val="0"/>
-          <w:numId w:val="3"/>
-        </w:numPr>
-        <w:tabs>
-          <w:tab w:val="left" w:pos="0"/>
-          <w:tab w:val="left" w:pos="360"/>
-        </w:tabs>
-        <w:rPr>
-          <w:rFonts w:asciiTheme="minorHAnsi" w:hAnsiTheme="minorHAnsi"/>
-          <w:b/>
-        </w:rPr>
-      </w:pPr>
-      <w:r>
-        <w:rPr>
-          <w:rFonts w:asciiTheme="minorHAnsi" w:hAnsiTheme="minorHAnsi"/>
-          <w:b/>
-        </w:rPr>
-        <w:lastRenderedPageBreak/>
+          <w:b/>
+          <w:bCs/>
+        </w:rPr>
+      </w:pPr>
+      <w:r>
+        <w:rPr>
+          <w:rFonts w:asciiTheme="minorHAnsi" w:hAnsiTheme="minorHAnsi" w:cs="Arial"/>
+          <w:b/>
+          <w:bCs/>
+        </w:rPr>
+        <w:t>7.</w:t>
+      </w:r>
+      <w:r>
+        <w:rPr>
+          <w:rFonts w:asciiTheme="minorHAnsi" w:hAnsiTheme="minorHAnsi" w:cs="Arial"/>
+          <w:b/>
+          <w:bCs/>
+        </w:rPr>
+        <w:t>1</w:t>
+      </w:r>
+      <w:r>
+        <w:rPr>
+          <w:rFonts w:asciiTheme="minorHAnsi" w:hAnsiTheme="minorHAnsi" w:cs="Arial"/>
+          <w:b/>
+          <w:bCs/>
+        </w:rPr>
         <w:t xml:space="preserve"> </w:t>
       </w:r>
       <w:r>
         <w:rPr>
-          <w:rFonts w:asciiTheme="minorHAnsi" w:hAnsiTheme="minorHAnsi"/>
-          <w:b/>
-        </w:rPr>
-        <w:t>Data Management and Transfer</w:t>
-      </w:r>
-    </w:p>
-    <w:p>
-      <w:pPr>
-        <w:spacing w:before="120" w:after="120"/>
-        <w:rPr>
-          <w:rFonts w:asciiTheme="minorHAnsi" w:hAnsiTheme="minorHAnsi" w:cs="Arial"/>
-        </w:rPr>
-      </w:pPr>
-      <w:r>
-        <w:rPr>
-          <w:rFonts w:asciiTheme="minorHAnsi" w:hAnsiTheme="minorHAnsi" w:cs="Arial"/>
-        </w:rPr>
-        <w:t>This section asks some basic questions ab</w:t>
-      </w:r>
-      <w:r>
-        <w:rPr>
-          <w:rFonts w:asciiTheme="minorHAnsi" w:hAnsiTheme="minorHAnsi" w:cs="Arial"/>
-        </w:rPr>
-        <w:t>out the data generated on Cirrus</w:t>
-      </w:r>
-      <w:r>
-        <w:rPr>
-          <w:rFonts w:asciiTheme="minorHAnsi" w:hAnsiTheme="minorHAnsi" w:cs="Arial"/>
-        </w:rPr>
-        <w:t xml:space="preserve"> by the proposed calculations. </w:t>
-      </w:r>
-    </w:p>
-    <w:p>
-      <w:pPr>
-        <w:spacing w:before="120" w:after="120"/>
-        <w:rPr>
           <w:rFonts w:asciiTheme="minorHAnsi" w:hAnsiTheme="minorHAnsi" w:cs="Arial"/>
           <w:b/>
           <w:bCs/>
         </w:rPr>
-      </w:pPr>
+        <w:t>State the category of data that will be uploaded/generated on Cirrus from the categories described at</w:t>
+      </w:r>
       <w:r>
         <w:rPr>
           <w:rFonts w:asciiTheme="minorHAnsi" w:hAnsiTheme="minorHAnsi" w:cs="Arial"/>
           <w:b/>
           <w:bCs/>
         </w:rPr>
-        <w:t>7.</w:t>
-      </w:r>
-      <w:r>
-        <w:rPr>
-          <w:rFonts w:asciiTheme="minorHAnsi" w:hAnsiTheme="minorHAnsi" w:cs="Arial"/>
-          <w:b/>
-          <w:bCs/>
-        </w:rPr>
-        <w:t>1</w:t>
-      </w:r>
-      <w:r>
-        <w:rPr>
-          <w:rFonts w:asciiTheme="minorHAnsi" w:hAnsiTheme="minorHAnsi" w:cs="Arial"/>
-          <w:b/>
-          <w:bCs/>
-        </w:rPr>
-        <w:t xml:space="preserve"> </w:t>
-      </w:r>
-      <w:r>
-        <w:rPr>
-          <w:rFonts w:asciiTheme="minorHAnsi" w:hAnsiTheme="minorHAnsi" w:cs="Arial"/>
-          <w:b/>
-          <w:bCs/>
-        </w:rPr>
-        <w:t>State the category of data that will be uploaded/generated on Cirrus from the categories described at</w:t>
-      </w:r>
-      <w:r>
-        <w:rPr>
-          <w:rFonts w:asciiTheme="minorHAnsi" w:hAnsiTheme="minorHAnsi" w:cs="Arial"/>
-          <w:b/>
-          <w:bCs/>
-        </w:rPr>
         <w:t xml:space="preserve">: </w:t>
       </w:r>
-      <w:hyperlink r:id="rId13" w:history="1">
+      <w:hyperlink r:id="rId12" w:history="1">
         <w:r>
           <w:rPr>
             <w:rStyle w:val="Hyperlink"/>
@@ -7798,10 +6138,12 @@
       </w:r>
     </w:p>
     <w:sectPr>
-      <w:headerReference w:type="even" r:id="rId14"/>
-      <w:headerReference w:type="default" r:id="rId15"/>
+      <w:headerReference w:type="even" r:id="rId13"/>
+      <w:headerReference w:type="default" r:id="rId14"/>
+      <w:footerReference w:type="even" r:id="rId15"/>
       <w:footerReference w:type="default" r:id="rId16"/>
       <w:headerReference w:type="first" r:id="rId17"/>
+      <w:footerReference w:type="first" r:id="rId18"/>
       <w:footnotePr>
         <w:pos w:val="beneathText"/>
       </w:footnotePr>
@@ -7834,6 +6176,16 @@
 </file>
 
 <file path=word/footer1.xml><?xml version="1.0" encoding="utf-8"?>
+<w:ftr xmlns:wpc="http://schemas.microsoft.com/office/word/2010/wordprocessingCanvas" xmlns:cx="http://schemas.microsoft.com/office/drawing/2014/chartex" xmlns:cx1="http://schemas.microsoft.com/office/drawing/2015/9/8/chartex" xmlns:cx2="http://schemas.microsoft.com/office/drawing/2015/10/21/chartex" xmlns:cx3="http://schemas.microsoft.com/office/drawing/2016/5/9/chartex" xmlns:cx4="http://schemas.microsoft.com/office/drawing/2016/5/10/chartex" xmlns:cx5="http://schemas.microsoft.com/office/drawing/2016/5/11/chartex" xmlns:cx6="http://schemas.microsoft.com/office/drawing/2016/5/12/chartex" xmlns:cx7="http://schemas.microsoft.com/office/drawing/2016/5/13/chartex" xmlns:cx8="http://schemas.microsoft.com/office/drawing/2016/5/14/chartex" xmlns:mc="http://schemas.openxmlformats.org/markup-compatibility/2006" xmlns:aink="http://schemas.microsoft.com/office/drawing/2016/ink" xmlns:am3d="http://schemas.microsoft.com/office/drawing/2017/model3d" xmlns:o="urn:schemas-microsoft-com:office:office" xmlns:oel="http://schemas.microsoft.com/office/2019/extlst" xmlns:r="http://schemas.openxmlformats.org/officeDocument/2006/relationships" xmlns:m="http://schemas.openxmlformats.org/officeDocument/2006/math" xmlns:v="urn:schemas-microsoft-com:vml" xmlns:wp14="http://schemas.microsoft.com/office/word/2010/wordprocessingDrawing" xmlns:wp="http://schemas.openxmlformats.org/drawingml/2006/wordprocessingDrawing" xmlns:w10="urn:schemas-microsoft-com:office:word" xmlns:w="http://schemas.openxmlformats.org/wordprocessingml/2006/main" xmlns:w14="http://schemas.microsoft.com/office/word/2010/wordml" xmlns:w15="http://schemas.microsoft.com/office/word/2012/wordml" xmlns:w16cex="http://schemas.microsoft.com/office/word/2018/wordml/cex" xmlns:w16cid="http://schemas.microsoft.com/office/word/2016/wordml/cid" xmlns:w16="http://schemas.microsoft.com/office/word/2018/wordml" xmlns:w16du="http://schemas.microsoft.com/office/word/2023/wordml/word16du" xmlns:w16sdtdh="http://schemas.microsoft.com/office/word/2020/wordml/sdtdatahash" xmlns:w16sdtfl="http://schemas.microsoft.com/office/word/2024/wordml/sdtformatlock" xmlns:w16se="http://schemas.microsoft.com/office/word/2015/wordml/symex" xmlns:wpg="http://schemas.microsoft.com/office/word/2010/wordprocessingGroup" xmlns:wpi="http://schemas.microsoft.com/office/word/2010/wordprocessingInk" xmlns:wne="http://schemas.microsoft.com/office/word/2006/wordml" xmlns:wps="http://schemas.microsoft.com/office/word/2010/wordprocessingShape" mc:Ignorable="w14 w15 w16se w16cid w16 w16cex w16sdtdh w16sdtfl w16du wp14">
+  <w:p>
+    <w:pPr>
+      <w:pStyle w:val="Footer"/>
+    </w:pPr>
+  </w:p>
+</w:ftr>
+</file>
+
+<file path=word/footer2.xml><?xml version="1.0" encoding="utf-8"?>
 <w:ftr xmlns:wpc="http://schemas.microsoft.com/office/word/2010/wordprocessingCanvas" xmlns:cx="http://schemas.microsoft.com/office/drawing/2014/chartex" xmlns:cx1="http://schemas.microsoft.com/office/drawing/2015/9/8/chartex" xmlns:cx2="http://schemas.microsoft.com/office/drawing/2015/10/21/chartex" xmlns:cx3="http://schemas.microsoft.com/office/drawing/2016/5/9/chartex" xmlns:cx4="http://schemas.microsoft.com/office/drawing/2016/5/10/chartex" xmlns:cx5="http://schemas.microsoft.com/office/drawing/2016/5/11/chartex" xmlns:cx6="http://schemas.microsoft.com/office/drawing/2016/5/12/chartex" xmlns:cx7="http://schemas.microsoft.com/office/drawing/2016/5/13/chartex" xmlns:cx8="http://schemas.microsoft.com/office/drawing/2016/5/14/chartex" xmlns:mc="http://schemas.openxmlformats.org/markup-compatibility/2006" xmlns:aink="http://schemas.microsoft.com/office/drawing/2016/ink" xmlns:am3d="http://schemas.microsoft.com/office/drawing/2017/model3d" xmlns:o="urn:schemas-microsoft-com:office:office" xmlns:oel="http://schemas.microsoft.com/office/2019/extlst" xmlns:r="http://schemas.openxmlformats.org/officeDocument/2006/relationships" xmlns:m="http://schemas.openxmlformats.org/officeDocument/2006/math" xmlns:v="urn:schemas-microsoft-com:vml" xmlns:wp14="http://schemas.microsoft.com/office/word/2010/wordprocessingDrawing" xmlns:wp="http://schemas.openxmlformats.org/drawingml/2006/wordprocessingDrawing" xmlns:w10="urn:schemas-microsoft-com:office:word" xmlns:w="http://schemas.openxmlformats.org/wordprocessingml/2006/main" xmlns:w14="http://schemas.microsoft.com/office/word/2010/wordml" xmlns:w15="http://schemas.microsoft.com/office/word/2012/wordml" xmlns:w16cex="http://schemas.microsoft.com/office/word/2018/wordml/cex" xmlns:w16cid="http://schemas.microsoft.com/office/word/2016/wordml/cid" xmlns:w16="http://schemas.microsoft.com/office/word/2018/wordml" xmlns:w16du="http://schemas.microsoft.com/office/word/2023/wordml/word16du" xmlns:w16sdtdh="http://schemas.microsoft.com/office/word/2020/wordml/sdtdatahash" xmlns:w16sdtfl="http://schemas.microsoft.com/office/word/2024/wordml/sdtformatlock" xmlns:w16se="http://schemas.microsoft.com/office/word/2015/wordml/symex" xmlns:wpg="http://schemas.microsoft.com/office/word/2010/wordprocessingGroup" xmlns:wpi="http://schemas.microsoft.com/office/word/2010/wordprocessingInk" xmlns:wne="http://schemas.microsoft.com/office/word/2006/wordml" xmlns:wps="http://schemas.microsoft.com/office/word/2010/wordprocessingShape" mc:Ignorable="w14 w15 w16se w16cid w16 w16cex w16sdtdh w16sdtfl w16du wp14">
   <w:p>
     <w:pPr>
@@ -8054,6 +6406,16 @@
       </w:rPr>
       <w:fldChar w:fldCharType="end"/>
     </w:r>
+  </w:p>
+</w:ftr>
+</file>
+
+<file path=word/footer3.xml><?xml version="1.0" encoding="utf-8"?>
+<w:ftr xmlns:wpc="http://schemas.microsoft.com/office/word/2010/wordprocessingCanvas" xmlns:cx="http://schemas.microsoft.com/office/drawing/2014/chartex" xmlns:cx1="http://schemas.microsoft.com/office/drawing/2015/9/8/chartex" xmlns:cx2="http://schemas.microsoft.com/office/drawing/2015/10/21/chartex" xmlns:cx3="http://schemas.microsoft.com/office/drawing/2016/5/9/chartex" xmlns:cx4="http://schemas.microsoft.com/office/drawing/2016/5/10/chartex" xmlns:cx5="http://schemas.microsoft.com/office/drawing/2016/5/11/chartex" xmlns:cx6="http://schemas.microsoft.com/office/drawing/2016/5/12/chartex" xmlns:cx7="http://schemas.microsoft.com/office/drawing/2016/5/13/chartex" xmlns:cx8="http://schemas.microsoft.com/office/drawing/2016/5/14/chartex" xmlns:mc="http://schemas.openxmlformats.org/markup-compatibility/2006" xmlns:aink="http://schemas.microsoft.com/office/drawing/2016/ink" xmlns:am3d="http://schemas.microsoft.com/office/drawing/2017/model3d" xmlns:o="urn:schemas-microsoft-com:office:office" xmlns:oel="http://schemas.microsoft.com/office/2019/extlst" xmlns:r="http://schemas.openxmlformats.org/officeDocument/2006/relationships" xmlns:m="http://schemas.openxmlformats.org/officeDocument/2006/math" xmlns:v="urn:schemas-microsoft-com:vml" xmlns:wp14="http://schemas.microsoft.com/office/word/2010/wordprocessingDrawing" xmlns:wp="http://schemas.openxmlformats.org/drawingml/2006/wordprocessingDrawing" xmlns:w10="urn:schemas-microsoft-com:office:word" xmlns:w="http://schemas.openxmlformats.org/wordprocessingml/2006/main" xmlns:w14="http://schemas.microsoft.com/office/word/2010/wordml" xmlns:w15="http://schemas.microsoft.com/office/word/2012/wordml" xmlns:w16cex="http://schemas.microsoft.com/office/word/2018/wordml/cex" xmlns:w16cid="http://schemas.microsoft.com/office/word/2016/wordml/cid" xmlns:w16="http://schemas.microsoft.com/office/word/2018/wordml" xmlns:w16du="http://schemas.microsoft.com/office/word/2023/wordml/word16du" xmlns:w16sdtdh="http://schemas.microsoft.com/office/word/2020/wordml/sdtdatahash" xmlns:w16sdtfl="http://schemas.microsoft.com/office/word/2024/wordml/sdtformatlock" xmlns:w16se="http://schemas.microsoft.com/office/word/2015/wordml/symex" xmlns:wpg="http://schemas.microsoft.com/office/word/2010/wordprocessingGroup" xmlns:wpi="http://schemas.microsoft.com/office/word/2010/wordprocessingInk" xmlns:wne="http://schemas.microsoft.com/office/word/2006/wordml" xmlns:wps="http://schemas.microsoft.com/office/word/2010/wordprocessingShape" mc:Ignorable="w14 w15 w16se w16cid w16 w16cex w16sdtdh w16sdtfl w16du wp14">
+  <w:p>
+    <w:pPr>
+      <w:pStyle w:val="Footer"/>
+    </w:pPr>
   </w:p>
 </w:ftr>
 </file>

</xml_diff>

<commit_message>
Updates controlled data question to clarify
</commit_message>
<xml_diff>
--- a/content/support-access/access/Cirrus-TA-Grant-form.docx
+++ b/content/support-access/access/Cirrus-TA-Grant-form.docx
@@ -1,6 +1,6 @@
 
 <file path=word/document.xml><?xml version="1.0" encoding="utf-8"?>
-<w:document xmlns:wpc="http://schemas.microsoft.com/office/word/2010/wordprocessingCanvas" xmlns:cx="http://schemas.microsoft.com/office/drawing/2014/chartex" xmlns:cx1="http://schemas.microsoft.com/office/drawing/2015/9/8/chartex" xmlns:cx2="http://schemas.microsoft.com/office/drawing/2015/10/21/chartex" xmlns:cx3="http://schemas.microsoft.com/office/drawing/2016/5/9/chartex" xmlns:cx4="http://schemas.microsoft.com/office/drawing/2016/5/10/chartex" xmlns:cx5="http://schemas.microsoft.com/office/drawing/2016/5/11/chartex" xmlns:cx6="http://schemas.microsoft.com/office/drawing/2016/5/12/chartex" xmlns:cx7="http://schemas.microsoft.com/office/drawing/2016/5/13/chartex" xmlns:cx8="http://schemas.microsoft.com/office/drawing/2016/5/14/chartex" xmlns:mc="http://schemas.openxmlformats.org/markup-compatibility/2006" xmlns:aink="http://schemas.microsoft.com/office/drawing/2016/ink" xmlns:am3d="http://schemas.microsoft.com/office/drawing/2017/model3d" xmlns:o="urn:schemas-microsoft-com:office:office" xmlns:oel="http://schemas.microsoft.com/office/2019/extlst" xmlns:r="http://schemas.openxmlformats.org/officeDocument/2006/relationships" xmlns:m="http://schemas.openxmlformats.org/officeDocument/2006/math" xmlns:v="urn:schemas-microsoft-com:vml" xmlns:wp14="http://schemas.microsoft.com/office/word/2010/wordprocessingDrawing" xmlns:wp="http://schemas.openxmlformats.org/drawingml/2006/wordprocessingDrawing" xmlns:w10="urn:schemas-microsoft-com:office:word" xmlns:w="http://schemas.openxmlformats.org/wordprocessingml/2006/main" xmlns:w14="http://schemas.microsoft.com/office/word/2010/wordml" xmlns:w15="http://schemas.microsoft.com/office/word/2012/wordml" xmlns:w16cex="http://schemas.microsoft.com/office/word/2018/wordml/cex" xmlns:w16cid="http://schemas.microsoft.com/office/word/2016/wordml/cid" xmlns:w16="http://schemas.microsoft.com/office/word/2018/wordml" xmlns:w16du="http://schemas.microsoft.com/office/word/2023/wordml/word16du" xmlns:w16sdtdh="http://schemas.microsoft.com/office/word/2020/wordml/sdtdatahash" xmlns:w16sdtfl="http://schemas.microsoft.com/office/word/2024/wordml/sdtformatlock" xmlns:w16se="http://schemas.microsoft.com/office/word/2015/wordml/symex" xmlns:wpg="http://schemas.microsoft.com/office/word/2010/wordprocessingGroup" xmlns:wpi="http://schemas.microsoft.com/office/word/2010/wordprocessingInk" xmlns:wne="http://schemas.microsoft.com/office/word/2006/wordml" xmlns:wps="http://schemas.microsoft.com/office/word/2010/wordprocessingShape" mc:Ignorable="w14 w15 w16se w16cid w16 w16cex w16sdtdh w16sdtfl w16du wp14">
+<w:document xmlns:wpc="http://schemas.microsoft.com/office/word/2010/wordprocessingCanvas" xmlns:cx="http://schemas.microsoft.com/office/drawing/2014/chartex" xmlns:cx1="http://schemas.microsoft.com/office/drawing/2015/9/8/chartex" xmlns:cx2="http://schemas.microsoft.com/office/drawing/2015/10/21/chartex" xmlns:cx3="http://schemas.microsoft.com/office/drawing/2016/5/9/chartex" xmlns:cx4="http://schemas.microsoft.com/office/drawing/2016/5/10/chartex" xmlns:cx5="http://schemas.microsoft.com/office/drawing/2016/5/11/chartex" xmlns:cx6="http://schemas.microsoft.com/office/drawing/2016/5/12/chartex" xmlns:cx7="http://schemas.microsoft.com/office/drawing/2016/5/13/chartex" xmlns:cx8="http://schemas.microsoft.com/office/drawing/2016/5/14/chartex" xmlns:mc="http://schemas.openxmlformats.org/markup-compatibility/2006" xmlns:m="http://schemas.openxmlformats.org/officeDocument/2006/math" xmlns:aink="http://schemas.microsoft.com/office/drawing/2016/ink" xmlns:am3d="http://schemas.microsoft.com/office/drawing/2017/model3d" xmlns:oel="http://schemas.microsoft.com/office/2019/extlst" xmlns:r="http://schemas.openxmlformats.org/officeDocument/2006/relationships" xmlns:wp14="http://schemas.microsoft.com/office/word/2010/wordprocessingDrawing" xmlns:wp="http://schemas.openxmlformats.org/drawingml/2006/wordprocessingDrawing" xmlns:wpg="http://schemas.microsoft.com/office/word/2010/wordprocessingGroup" xmlns:wpi="http://schemas.microsoft.com/office/word/2010/wordprocessingInk" xmlns:wps="http://schemas.microsoft.com/office/word/2010/wordprocessingShape" xmlns:o="urn:schemas-microsoft-com:office:office" xmlns:v="urn:schemas-microsoft-com:vml" xmlns:w10="urn:schemas-microsoft-com:office:word" xmlns:w="http://schemas.openxmlformats.org/wordprocessingml/2006/main" xmlns:w14="http://schemas.microsoft.com/office/word/2010/wordml" xmlns:w15="http://schemas.microsoft.com/office/word/2012/wordml" xmlns:w16cex="http://schemas.microsoft.com/office/word/2018/wordml/cex" xmlns:w16cid="http://schemas.microsoft.com/office/word/2016/wordml/cid" xmlns:w16="http://schemas.microsoft.com/office/word/2018/wordml" xmlns:w16sdtdh="http://schemas.microsoft.com/office/word/2020/wordml/sdtdatahash" xmlns:w16sdtfl="http://schemas.microsoft.com/office/word/2024/wordml/sdtformatlock" xmlns:w16se="http://schemas.microsoft.com/office/word/2015/wordml/symex" xmlns:w16du="http://schemas.microsoft.com/office/word/2023/wordml/word16du" xmlns:wne="http://schemas.microsoft.com/office/word/2006/wordml" mc:Ignorable="w14 w15 w16se w16cid w16 w16cex w16sdtdh w16sdtfl w16du wp14">
   <w:background w:color="E5DFEC" w:themeColor="accent4" w:themeTint="33"/>
   <w:body>
     <w:p>
@@ -98,7 +98,7 @@
                         <a:effectLst/>
                         <a:extLst>
                           <a:ext uri="{C572A759-6A51-4108-AA02-DFA0A04FC94B}">
-                            <ma14:wrappingTextBoxFlag xmlns:ma14="http://schemas.microsoft.com/office/mac/drawingml/2011/main" xmlns:w="http://schemas.openxmlformats.org/wordprocessingml/2006/main" xmlns:w10="urn:schemas-microsoft-com:office:word" xmlns:v="urn:schemas-microsoft-com:vml" xmlns:o="urn:schemas-microsoft-com:office:office" xmlns:mv="urn:schemas-microsoft-com:mac:vml" xmlns:mo="http://schemas.microsoft.com/office/mac/office/2008/main" xmlns=""/>
+                            <ma14:wrappingTextBoxFlag xmlns="" xmlns:mo="http://schemas.microsoft.com/office/mac/office/2008/main" xmlns:mv="urn:schemas-microsoft-com:mac:vml" xmlns:o="urn:schemas-microsoft-com:office:office" xmlns:v="urn:schemas-microsoft-com:vml" xmlns:w10="urn:schemas-microsoft-com:office:word" xmlns:w="http://schemas.openxmlformats.org/wordprocessingml/2006/main" xmlns:ma14="http://schemas.microsoft.com/office/mac/drawingml/2011/main"/>
                           </a:ext>
                         </a:extLst>
                       </wps:spPr>
@@ -5046,7 +5046,7 @@
           <w:b/>
           <w:bCs/>
         </w:rPr>
-        <w:t>7.</w:t>
+        <w:t xml:space="preserve">7.1 </w:t>
       </w:r>
       <w:r>
         <w:rPr>
@@ -5054,23 +5054,7 @@
           <w:b/>
           <w:bCs/>
         </w:rPr>
-        <w:t>1</w:t>
-      </w:r>
-      <w:r>
-        <w:rPr>
-          <w:rFonts w:asciiTheme="minorHAnsi" w:hAnsiTheme="minorHAnsi" w:cs="Arial"/>
-          <w:b/>
-          <w:bCs/>
-        </w:rPr>
-        <w:t xml:space="preserve"> </w:t>
-      </w:r>
-      <w:r>
-        <w:rPr>
-          <w:rFonts w:asciiTheme="minorHAnsi" w:hAnsiTheme="minorHAnsi" w:cs="Arial"/>
-          <w:b/>
-          <w:bCs/>
-        </w:rPr>
-        <w:t>State the category of data that will be uploaded/generated on Cirrus from the categories described at</w:t>
+        <w:t>Please confirm whether the data uploaded/generated on Cirrus requires any special controls as described at</w:t>
       </w:r>
       <w:r>
         <w:rPr>
@@ -5115,6 +5099,22 @@
         </w:rPr>
         <w:t>If you need to, please include details of relevant data usage agreements with your access request.</w:t>
       </w:r>
+      <w:r>
+        <w:rPr>
+          <w:rFonts w:asciiTheme="minorHAnsi" w:hAnsiTheme="minorHAnsi" w:cs="Arial"/>
+          <w:b/>
+          <w:bCs/>
+        </w:rPr>
+        <w:t xml:space="preserve"> </w:t>
+      </w:r>
+      <w:r>
+        <w:rPr>
+          <w:rFonts w:asciiTheme="minorHAnsi" w:hAnsiTheme="minorHAnsi" w:cs="Arial"/>
+          <w:b/>
+          <w:bCs/>
+        </w:rPr>
+        <w:t>If no special controls are required please just answer "No controlled data".</w:t>
+      </w:r>
     </w:p>
     <w:p>
       <w:pPr>
@@ -5128,7 +5128,35 @@
           <w:rFonts w:asciiTheme="minorHAnsi" w:hAnsiTheme="minorHAnsi" w:cs="Arial"/>
           <w:highlight w:val="cyan"/>
         </w:rPr>
-        <w:t>[Describe what category from the link above your data falls under and, if required provide links to relevant data usage agreements. If your data is not Government Data, Personal Data, Copyrighted Data or Ethically-Sensitive Data, you can state “No sensitive data” in answer to this question.]</w:t>
+        <w:t xml:space="preserve">[Describe </w:t>
+      </w:r>
+      <w:r>
+        <w:rPr>
+          <w:rFonts w:asciiTheme="minorHAnsi" w:hAnsiTheme="minorHAnsi" w:cs="Arial"/>
+          <w:highlight w:val="cyan"/>
+        </w:rPr>
+        <w:t>any special controls required for the data you will be processing on Cirrus</w:t>
+      </w:r>
+      <w:r>
+        <w:rPr>
+          <w:rFonts w:asciiTheme="minorHAnsi" w:hAnsiTheme="minorHAnsi" w:cs="Arial"/>
+          <w:highlight w:val="cyan"/>
+        </w:rPr>
+        <w:t>.</w:t>
+      </w:r>
+      <w:r>
+        <w:rPr>
+          <w:rFonts w:asciiTheme="minorHAnsi" w:hAnsiTheme="minorHAnsi" w:cs="Arial"/>
+          <w:highlight w:val="cyan"/>
+        </w:rPr>
+        <w:t xml:space="preserve"> </w:t>
+      </w:r>
+      <w:r>
+        <w:rPr>
+          <w:rFonts w:asciiTheme="minorHAnsi" w:hAnsiTheme="minorHAnsi" w:cs="Arial"/>
+          <w:highlight w:val="cyan"/>
+        </w:rPr>
+        <w:t>If no special controls are required please just answer "No controlled data".]</w:t>
       </w:r>
     </w:p>
     <w:p>
@@ -6157,7 +6185,7 @@
 </file>
 
 <file path=word/endnotes.xml><?xml version="1.0" encoding="utf-8"?>
-<w:endnotes xmlns:wpc="http://schemas.microsoft.com/office/word/2010/wordprocessingCanvas" xmlns:cx="http://schemas.microsoft.com/office/drawing/2014/chartex" xmlns:cx1="http://schemas.microsoft.com/office/drawing/2015/9/8/chartex" xmlns:cx2="http://schemas.microsoft.com/office/drawing/2015/10/21/chartex" xmlns:cx3="http://schemas.microsoft.com/office/drawing/2016/5/9/chartex" xmlns:cx4="http://schemas.microsoft.com/office/drawing/2016/5/10/chartex" xmlns:cx5="http://schemas.microsoft.com/office/drawing/2016/5/11/chartex" xmlns:cx6="http://schemas.microsoft.com/office/drawing/2016/5/12/chartex" xmlns:cx7="http://schemas.microsoft.com/office/drawing/2016/5/13/chartex" xmlns:cx8="http://schemas.microsoft.com/office/drawing/2016/5/14/chartex" xmlns:mc="http://schemas.openxmlformats.org/markup-compatibility/2006" xmlns:aink="http://schemas.microsoft.com/office/drawing/2016/ink" xmlns:am3d="http://schemas.microsoft.com/office/drawing/2017/model3d" xmlns:o="urn:schemas-microsoft-com:office:office" xmlns:oel="http://schemas.microsoft.com/office/2019/extlst" xmlns:r="http://schemas.openxmlformats.org/officeDocument/2006/relationships" xmlns:m="http://schemas.openxmlformats.org/officeDocument/2006/math" xmlns:v="urn:schemas-microsoft-com:vml" xmlns:wp14="http://schemas.microsoft.com/office/word/2010/wordprocessingDrawing" xmlns:wp="http://schemas.openxmlformats.org/drawingml/2006/wordprocessingDrawing" xmlns:w10="urn:schemas-microsoft-com:office:word" xmlns:w="http://schemas.openxmlformats.org/wordprocessingml/2006/main" xmlns:w14="http://schemas.microsoft.com/office/word/2010/wordml" xmlns:w15="http://schemas.microsoft.com/office/word/2012/wordml" xmlns:w16cex="http://schemas.microsoft.com/office/word/2018/wordml/cex" xmlns:w16cid="http://schemas.microsoft.com/office/word/2016/wordml/cid" xmlns:w16="http://schemas.microsoft.com/office/word/2018/wordml" xmlns:w16du="http://schemas.microsoft.com/office/word/2023/wordml/word16du" xmlns:w16sdtdh="http://schemas.microsoft.com/office/word/2020/wordml/sdtdatahash" xmlns:w16sdtfl="http://schemas.microsoft.com/office/word/2024/wordml/sdtformatlock" xmlns:w16se="http://schemas.microsoft.com/office/word/2015/wordml/symex" xmlns:wpg="http://schemas.microsoft.com/office/word/2010/wordprocessingGroup" xmlns:wpi="http://schemas.microsoft.com/office/word/2010/wordprocessingInk" xmlns:wne="http://schemas.microsoft.com/office/word/2006/wordml" xmlns:wps="http://schemas.microsoft.com/office/word/2010/wordprocessingShape" mc:Ignorable="w14 w15 w16se w16cid w16 w16cex w16sdtdh w16sdtfl w16du wp14">
+<w:endnotes xmlns:wpc="http://schemas.microsoft.com/office/word/2010/wordprocessingCanvas" xmlns:cx="http://schemas.microsoft.com/office/drawing/2014/chartex" xmlns:cx1="http://schemas.microsoft.com/office/drawing/2015/9/8/chartex" xmlns:cx2="http://schemas.microsoft.com/office/drawing/2015/10/21/chartex" xmlns:cx3="http://schemas.microsoft.com/office/drawing/2016/5/9/chartex" xmlns:cx4="http://schemas.microsoft.com/office/drawing/2016/5/10/chartex" xmlns:cx5="http://schemas.microsoft.com/office/drawing/2016/5/11/chartex" xmlns:cx6="http://schemas.microsoft.com/office/drawing/2016/5/12/chartex" xmlns:cx7="http://schemas.microsoft.com/office/drawing/2016/5/13/chartex" xmlns:cx8="http://schemas.microsoft.com/office/drawing/2016/5/14/chartex" xmlns:mc="http://schemas.openxmlformats.org/markup-compatibility/2006" xmlns:m="http://schemas.openxmlformats.org/officeDocument/2006/math" xmlns:aink="http://schemas.microsoft.com/office/drawing/2016/ink" xmlns:am3d="http://schemas.microsoft.com/office/drawing/2017/model3d" xmlns:oel="http://schemas.microsoft.com/office/2019/extlst" xmlns:r="http://schemas.openxmlformats.org/officeDocument/2006/relationships" xmlns:wp14="http://schemas.microsoft.com/office/word/2010/wordprocessingDrawing" xmlns:wp="http://schemas.openxmlformats.org/drawingml/2006/wordprocessingDrawing" xmlns:wpg="http://schemas.microsoft.com/office/word/2010/wordprocessingGroup" xmlns:wpi="http://schemas.microsoft.com/office/word/2010/wordprocessingInk" xmlns:wps="http://schemas.microsoft.com/office/word/2010/wordprocessingShape" xmlns:o="urn:schemas-microsoft-com:office:office" xmlns:v="urn:schemas-microsoft-com:vml" xmlns:w10="urn:schemas-microsoft-com:office:word" xmlns:w="http://schemas.openxmlformats.org/wordprocessingml/2006/main" xmlns:w14="http://schemas.microsoft.com/office/word/2010/wordml" xmlns:w15="http://schemas.microsoft.com/office/word/2012/wordml" xmlns:w16cex="http://schemas.microsoft.com/office/word/2018/wordml/cex" xmlns:w16cid="http://schemas.microsoft.com/office/word/2016/wordml/cid" xmlns:w16="http://schemas.microsoft.com/office/word/2018/wordml" xmlns:w16sdtdh="http://schemas.microsoft.com/office/word/2020/wordml/sdtdatahash" xmlns:w16sdtfl="http://schemas.microsoft.com/office/word/2024/wordml/sdtformatlock" xmlns:w16se="http://schemas.microsoft.com/office/word/2015/wordml/symex" xmlns:w16du="http://schemas.microsoft.com/office/word/2023/wordml/word16du" xmlns:wne="http://schemas.microsoft.com/office/word/2006/wordml" mc:Ignorable="w14 w15 w16se w16cid w16 w16cex w16sdtdh w16sdtfl w16du wp14">
   <w:endnote w:type="separator" w:id="-1">
     <w:p>
       <w:r>
@@ -6176,7 +6204,7 @@
 </file>
 
 <file path=word/footer1.xml><?xml version="1.0" encoding="utf-8"?>
-<w:ftr xmlns:wpc="http://schemas.microsoft.com/office/word/2010/wordprocessingCanvas" xmlns:cx="http://schemas.microsoft.com/office/drawing/2014/chartex" xmlns:cx1="http://schemas.microsoft.com/office/drawing/2015/9/8/chartex" xmlns:cx2="http://schemas.microsoft.com/office/drawing/2015/10/21/chartex" xmlns:cx3="http://schemas.microsoft.com/office/drawing/2016/5/9/chartex" xmlns:cx4="http://schemas.microsoft.com/office/drawing/2016/5/10/chartex" xmlns:cx5="http://schemas.microsoft.com/office/drawing/2016/5/11/chartex" xmlns:cx6="http://schemas.microsoft.com/office/drawing/2016/5/12/chartex" xmlns:cx7="http://schemas.microsoft.com/office/drawing/2016/5/13/chartex" xmlns:cx8="http://schemas.microsoft.com/office/drawing/2016/5/14/chartex" xmlns:mc="http://schemas.openxmlformats.org/markup-compatibility/2006" xmlns:aink="http://schemas.microsoft.com/office/drawing/2016/ink" xmlns:am3d="http://schemas.microsoft.com/office/drawing/2017/model3d" xmlns:o="urn:schemas-microsoft-com:office:office" xmlns:oel="http://schemas.microsoft.com/office/2019/extlst" xmlns:r="http://schemas.openxmlformats.org/officeDocument/2006/relationships" xmlns:m="http://schemas.openxmlformats.org/officeDocument/2006/math" xmlns:v="urn:schemas-microsoft-com:vml" xmlns:wp14="http://schemas.microsoft.com/office/word/2010/wordprocessingDrawing" xmlns:wp="http://schemas.openxmlformats.org/drawingml/2006/wordprocessingDrawing" xmlns:w10="urn:schemas-microsoft-com:office:word" xmlns:w="http://schemas.openxmlformats.org/wordprocessingml/2006/main" xmlns:w14="http://schemas.microsoft.com/office/word/2010/wordml" xmlns:w15="http://schemas.microsoft.com/office/word/2012/wordml" xmlns:w16cex="http://schemas.microsoft.com/office/word/2018/wordml/cex" xmlns:w16cid="http://schemas.microsoft.com/office/word/2016/wordml/cid" xmlns:w16="http://schemas.microsoft.com/office/word/2018/wordml" xmlns:w16du="http://schemas.microsoft.com/office/word/2023/wordml/word16du" xmlns:w16sdtdh="http://schemas.microsoft.com/office/word/2020/wordml/sdtdatahash" xmlns:w16sdtfl="http://schemas.microsoft.com/office/word/2024/wordml/sdtformatlock" xmlns:w16se="http://schemas.microsoft.com/office/word/2015/wordml/symex" xmlns:wpg="http://schemas.microsoft.com/office/word/2010/wordprocessingGroup" xmlns:wpi="http://schemas.microsoft.com/office/word/2010/wordprocessingInk" xmlns:wne="http://schemas.microsoft.com/office/word/2006/wordml" xmlns:wps="http://schemas.microsoft.com/office/word/2010/wordprocessingShape" mc:Ignorable="w14 w15 w16se w16cid w16 w16cex w16sdtdh w16sdtfl w16du wp14">
+<w:ftr xmlns:wpc="http://schemas.microsoft.com/office/word/2010/wordprocessingCanvas" xmlns:cx="http://schemas.microsoft.com/office/drawing/2014/chartex" xmlns:cx1="http://schemas.microsoft.com/office/drawing/2015/9/8/chartex" xmlns:cx2="http://schemas.microsoft.com/office/drawing/2015/10/21/chartex" xmlns:cx3="http://schemas.microsoft.com/office/drawing/2016/5/9/chartex" xmlns:cx4="http://schemas.microsoft.com/office/drawing/2016/5/10/chartex" xmlns:cx5="http://schemas.microsoft.com/office/drawing/2016/5/11/chartex" xmlns:cx6="http://schemas.microsoft.com/office/drawing/2016/5/12/chartex" xmlns:cx7="http://schemas.microsoft.com/office/drawing/2016/5/13/chartex" xmlns:cx8="http://schemas.microsoft.com/office/drawing/2016/5/14/chartex" xmlns:mc="http://schemas.openxmlformats.org/markup-compatibility/2006" xmlns:m="http://schemas.openxmlformats.org/officeDocument/2006/math" xmlns:aink="http://schemas.microsoft.com/office/drawing/2016/ink" xmlns:am3d="http://schemas.microsoft.com/office/drawing/2017/model3d" xmlns:oel="http://schemas.microsoft.com/office/2019/extlst" xmlns:r="http://schemas.openxmlformats.org/officeDocument/2006/relationships" xmlns:wp14="http://schemas.microsoft.com/office/word/2010/wordprocessingDrawing" xmlns:wp="http://schemas.openxmlformats.org/drawingml/2006/wordprocessingDrawing" xmlns:wpg="http://schemas.microsoft.com/office/word/2010/wordprocessingGroup" xmlns:wpi="http://schemas.microsoft.com/office/word/2010/wordprocessingInk" xmlns:wps="http://schemas.microsoft.com/office/word/2010/wordprocessingShape" xmlns:o="urn:schemas-microsoft-com:office:office" xmlns:v="urn:schemas-microsoft-com:vml" xmlns:w10="urn:schemas-microsoft-com:office:word" xmlns:w="http://schemas.openxmlformats.org/wordprocessingml/2006/main" xmlns:w14="http://schemas.microsoft.com/office/word/2010/wordml" xmlns:w15="http://schemas.microsoft.com/office/word/2012/wordml" xmlns:w16cex="http://schemas.microsoft.com/office/word/2018/wordml/cex" xmlns:w16cid="http://schemas.microsoft.com/office/word/2016/wordml/cid" xmlns:w16="http://schemas.microsoft.com/office/word/2018/wordml" xmlns:w16sdtdh="http://schemas.microsoft.com/office/word/2020/wordml/sdtdatahash" xmlns:w16sdtfl="http://schemas.microsoft.com/office/word/2024/wordml/sdtformatlock" xmlns:w16se="http://schemas.microsoft.com/office/word/2015/wordml/symex" xmlns:w16du="http://schemas.microsoft.com/office/word/2023/wordml/word16du" xmlns:wne="http://schemas.microsoft.com/office/word/2006/wordml" mc:Ignorable="w14 w15 w16se w16cid w16 w16cex w16sdtdh w16sdtfl w16du wp14">
   <w:p>
     <w:pPr>
       <w:pStyle w:val="Footer"/>
@@ -6186,7 +6214,7 @@
 </file>
 
 <file path=word/footer2.xml><?xml version="1.0" encoding="utf-8"?>
-<w:ftr xmlns:wpc="http://schemas.microsoft.com/office/word/2010/wordprocessingCanvas" xmlns:cx="http://schemas.microsoft.com/office/drawing/2014/chartex" xmlns:cx1="http://schemas.microsoft.com/office/drawing/2015/9/8/chartex" xmlns:cx2="http://schemas.microsoft.com/office/drawing/2015/10/21/chartex" xmlns:cx3="http://schemas.microsoft.com/office/drawing/2016/5/9/chartex" xmlns:cx4="http://schemas.microsoft.com/office/drawing/2016/5/10/chartex" xmlns:cx5="http://schemas.microsoft.com/office/drawing/2016/5/11/chartex" xmlns:cx6="http://schemas.microsoft.com/office/drawing/2016/5/12/chartex" xmlns:cx7="http://schemas.microsoft.com/office/drawing/2016/5/13/chartex" xmlns:cx8="http://schemas.microsoft.com/office/drawing/2016/5/14/chartex" xmlns:mc="http://schemas.openxmlformats.org/markup-compatibility/2006" xmlns:aink="http://schemas.microsoft.com/office/drawing/2016/ink" xmlns:am3d="http://schemas.microsoft.com/office/drawing/2017/model3d" xmlns:o="urn:schemas-microsoft-com:office:office" xmlns:oel="http://schemas.microsoft.com/office/2019/extlst" xmlns:r="http://schemas.openxmlformats.org/officeDocument/2006/relationships" xmlns:m="http://schemas.openxmlformats.org/officeDocument/2006/math" xmlns:v="urn:schemas-microsoft-com:vml" xmlns:wp14="http://schemas.microsoft.com/office/word/2010/wordprocessingDrawing" xmlns:wp="http://schemas.openxmlformats.org/drawingml/2006/wordprocessingDrawing" xmlns:w10="urn:schemas-microsoft-com:office:word" xmlns:w="http://schemas.openxmlformats.org/wordprocessingml/2006/main" xmlns:w14="http://schemas.microsoft.com/office/word/2010/wordml" xmlns:w15="http://schemas.microsoft.com/office/word/2012/wordml" xmlns:w16cex="http://schemas.microsoft.com/office/word/2018/wordml/cex" xmlns:w16cid="http://schemas.microsoft.com/office/word/2016/wordml/cid" xmlns:w16="http://schemas.microsoft.com/office/word/2018/wordml" xmlns:w16du="http://schemas.microsoft.com/office/word/2023/wordml/word16du" xmlns:w16sdtdh="http://schemas.microsoft.com/office/word/2020/wordml/sdtdatahash" xmlns:w16sdtfl="http://schemas.microsoft.com/office/word/2024/wordml/sdtformatlock" xmlns:w16se="http://schemas.microsoft.com/office/word/2015/wordml/symex" xmlns:wpg="http://schemas.microsoft.com/office/word/2010/wordprocessingGroup" xmlns:wpi="http://schemas.microsoft.com/office/word/2010/wordprocessingInk" xmlns:wne="http://schemas.microsoft.com/office/word/2006/wordml" xmlns:wps="http://schemas.microsoft.com/office/word/2010/wordprocessingShape" mc:Ignorable="w14 w15 w16se w16cid w16 w16cex w16sdtdh w16sdtfl w16du wp14">
+<w:ftr xmlns:wpc="http://schemas.microsoft.com/office/word/2010/wordprocessingCanvas" xmlns:cx="http://schemas.microsoft.com/office/drawing/2014/chartex" xmlns:cx1="http://schemas.microsoft.com/office/drawing/2015/9/8/chartex" xmlns:cx2="http://schemas.microsoft.com/office/drawing/2015/10/21/chartex" xmlns:cx3="http://schemas.microsoft.com/office/drawing/2016/5/9/chartex" xmlns:cx4="http://schemas.microsoft.com/office/drawing/2016/5/10/chartex" xmlns:cx5="http://schemas.microsoft.com/office/drawing/2016/5/11/chartex" xmlns:cx6="http://schemas.microsoft.com/office/drawing/2016/5/12/chartex" xmlns:cx7="http://schemas.microsoft.com/office/drawing/2016/5/13/chartex" xmlns:cx8="http://schemas.microsoft.com/office/drawing/2016/5/14/chartex" xmlns:mc="http://schemas.openxmlformats.org/markup-compatibility/2006" xmlns:m="http://schemas.openxmlformats.org/officeDocument/2006/math" xmlns:aink="http://schemas.microsoft.com/office/drawing/2016/ink" xmlns:am3d="http://schemas.microsoft.com/office/drawing/2017/model3d" xmlns:oel="http://schemas.microsoft.com/office/2019/extlst" xmlns:r="http://schemas.openxmlformats.org/officeDocument/2006/relationships" xmlns:wp14="http://schemas.microsoft.com/office/word/2010/wordprocessingDrawing" xmlns:wp="http://schemas.openxmlformats.org/drawingml/2006/wordprocessingDrawing" xmlns:wpg="http://schemas.microsoft.com/office/word/2010/wordprocessingGroup" xmlns:wpi="http://schemas.microsoft.com/office/word/2010/wordprocessingInk" xmlns:wps="http://schemas.microsoft.com/office/word/2010/wordprocessingShape" xmlns:o="urn:schemas-microsoft-com:office:office" xmlns:v="urn:schemas-microsoft-com:vml" xmlns:w10="urn:schemas-microsoft-com:office:word" xmlns:w="http://schemas.openxmlformats.org/wordprocessingml/2006/main" xmlns:w14="http://schemas.microsoft.com/office/word/2010/wordml" xmlns:w15="http://schemas.microsoft.com/office/word/2012/wordml" xmlns:w16cex="http://schemas.microsoft.com/office/word/2018/wordml/cex" xmlns:w16cid="http://schemas.microsoft.com/office/word/2016/wordml/cid" xmlns:w16="http://schemas.microsoft.com/office/word/2018/wordml" xmlns:w16sdtdh="http://schemas.microsoft.com/office/word/2020/wordml/sdtdatahash" xmlns:w16sdtfl="http://schemas.microsoft.com/office/word/2024/wordml/sdtformatlock" xmlns:w16se="http://schemas.microsoft.com/office/word/2015/wordml/symex" xmlns:w16du="http://schemas.microsoft.com/office/word/2023/wordml/word16du" xmlns:wne="http://schemas.microsoft.com/office/word/2006/wordml" mc:Ignorable="w14 w15 w16se w16cid w16 w16cex w16sdtdh w16sdtfl w16du wp14">
   <w:p>
     <w:pPr>
       <w:pStyle w:val="Footer"/>
@@ -6411,7 +6439,7 @@
 </file>
 
 <file path=word/footer3.xml><?xml version="1.0" encoding="utf-8"?>
-<w:ftr xmlns:wpc="http://schemas.microsoft.com/office/word/2010/wordprocessingCanvas" xmlns:cx="http://schemas.microsoft.com/office/drawing/2014/chartex" xmlns:cx1="http://schemas.microsoft.com/office/drawing/2015/9/8/chartex" xmlns:cx2="http://schemas.microsoft.com/office/drawing/2015/10/21/chartex" xmlns:cx3="http://schemas.microsoft.com/office/drawing/2016/5/9/chartex" xmlns:cx4="http://schemas.microsoft.com/office/drawing/2016/5/10/chartex" xmlns:cx5="http://schemas.microsoft.com/office/drawing/2016/5/11/chartex" xmlns:cx6="http://schemas.microsoft.com/office/drawing/2016/5/12/chartex" xmlns:cx7="http://schemas.microsoft.com/office/drawing/2016/5/13/chartex" xmlns:cx8="http://schemas.microsoft.com/office/drawing/2016/5/14/chartex" xmlns:mc="http://schemas.openxmlformats.org/markup-compatibility/2006" xmlns:aink="http://schemas.microsoft.com/office/drawing/2016/ink" xmlns:am3d="http://schemas.microsoft.com/office/drawing/2017/model3d" xmlns:o="urn:schemas-microsoft-com:office:office" xmlns:oel="http://schemas.microsoft.com/office/2019/extlst" xmlns:r="http://schemas.openxmlformats.org/officeDocument/2006/relationships" xmlns:m="http://schemas.openxmlformats.org/officeDocument/2006/math" xmlns:v="urn:schemas-microsoft-com:vml" xmlns:wp14="http://schemas.microsoft.com/office/word/2010/wordprocessingDrawing" xmlns:wp="http://schemas.openxmlformats.org/drawingml/2006/wordprocessingDrawing" xmlns:w10="urn:schemas-microsoft-com:office:word" xmlns:w="http://schemas.openxmlformats.org/wordprocessingml/2006/main" xmlns:w14="http://schemas.microsoft.com/office/word/2010/wordml" xmlns:w15="http://schemas.microsoft.com/office/word/2012/wordml" xmlns:w16cex="http://schemas.microsoft.com/office/word/2018/wordml/cex" xmlns:w16cid="http://schemas.microsoft.com/office/word/2016/wordml/cid" xmlns:w16="http://schemas.microsoft.com/office/word/2018/wordml" xmlns:w16du="http://schemas.microsoft.com/office/word/2023/wordml/word16du" xmlns:w16sdtdh="http://schemas.microsoft.com/office/word/2020/wordml/sdtdatahash" xmlns:w16sdtfl="http://schemas.microsoft.com/office/word/2024/wordml/sdtformatlock" xmlns:w16se="http://schemas.microsoft.com/office/word/2015/wordml/symex" xmlns:wpg="http://schemas.microsoft.com/office/word/2010/wordprocessingGroup" xmlns:wpi="http://schemas.microsoft.com/office/word/2010/wordprocessingInk" xmlns:wne="http://schemas.microsoft.com/office/word/2006/wordml" xmlns:wps="http://schemas.microsoft.com/office/word/2010/wordprocessingShape" mc:Ignorable="w14 w15 w16se w16cid w16 w16cex w16sdtdh w16sdtfl w16du wp14">
+<w:ftr xmlns:wpc="http://schemas.microsoft.com/office/word/2010/wordprocessingCanvas" xmlns:cx="http://schemas.microsoft.com/office/drawing/2014/chartex" xmlns:cx1="http://schemas.microsoft.com/office/drawing/2015/9/8/chartex" xmlns:cx2="http://schemas.microsoft.com/office/drawing/2015/10/21/chartex" xmlns:cx3="http://schemas.microsoft.com/office/drawing/2016/5/9/chartex" xmlns:cx4="http://schemas.microsoft.com/office/drawing/2016/5/10/chartex" xmlns:cx5="http://schemas.microsoft.com/office/drawing/2016/5/11/chartex" xmlns:cx6="http://schemas.microsoft.com/office/drawing/2016/5/12/chartex" xmlns:cx7="http://schemas.microsoft.com/office/drawing/2016/5/13/chartex" xmlns:cx8="http://schemas.microsoft.com/office/drawing/2016/5/14/chartex" xmlns:mc="http://schemas.openxmlformats.org/markup-compatibility/2006" xmlns:m="http://schemas.openxmlformats.org/officeDocument/2006/math" xmlns:aink="http://schemas.microsoft.com/office/drawing/2016/ink" xmlns:am3d="http://schemas.microsoft.com/office/drawing/2017/model3d" xmlns:oel="http://schemas.microsoft.com/office/2019/extlst" xmlns:r="http://schemas.openxmlformats.org/officeDocument/2006/relationships" xmlns:wp14="http://schemas.microsoft.com/office/word/2010/wordprocessingDrawing" xmlns:wp="http://schemas.openxmlformats.org/drawingml/2006/wordprocessingDrawing" xmlns:wpg="http://schemas.microsoft.com/office/word/2010/wordprocessingGroup" xmlns:wpi="http://schemas.microsoft.com/office/word/2010/wordprocessingInk" xmlns:wps="http://schemas.microsoft.com/office/word/2010/wordprocessingShape" xmlns:o="urn:schemas-microsoft-com:office:office" xmlns:v="urn:schemas-microsoft-com:vml" xmlns:w10="urn:schemas-microsoft-com:office:word" xmlns:w="http://schemas.openxmlformats.org/wordprocessingml/2006/main" xmlns:w14="http://schemas.microsoft.com/office/word/2010/wordml" xmlns:w15="http://schemas.microsoft.com/office/word/2012/wordml" xmlns:w16cex="http://schemas.microsoft.com/office/word/2018/wordml/cex" xmlns:w16cid="http://schemas.microsoft.com/office/word/2016/wordml/cid" xmlns:w16="http://schemas.microsoft.com/office/word/2018/wordml" xmlns:w16sdtdh="http://schemas.microsoft.com/office/word/2020/wordml/sdtdatahash" xmlns:w16sdtfl="http://schemas.microsoft.com/office/word/2024/wordml/sdtformatlock" xmlns:w16se="http://schemas.microsoft.com/office/word/2015/wordml/symex" xmlns:w16du="http://schemas.microsoft.com/office/word/2023/wordml/word16du" xmlns:wne="http://schemas.microsoft.com/office/word/2006/wordml" mc:Ignorable="w14 w15 w16se w16cid w16 w16cex w16sdtdh w16sdtfl w16du wp14">
   <w:p>
     <w:pPr>
       <w:pStyle w:val="Footer"/>
@@ -6421,7 +6449,7 @@
 </file>
 
 <file path=word/footnotes.xml><?xml version="1.0" encoding="utf-8"?>
-<w:footnotes xmlns:wpc="http://schemas.microsoft.com/office/word/2010/wordprocessingCanvas" xmlns:cx="http://schemas.microsoft.com/office/drawing/2014/chartex" xmlns:cx1="http://schemas.microsoft.com/office/drawing/2015/9/8/chartex" xmlns:cx2="http://schemas.microsoft.com/office/drawing/2015/10/21/chartex" xmlns:cx3="http://schemas.microsoft.com/office/drawing/2016/5/9/chartex" xmlns:cx4="http://schemas.microsoft.com/office/drawing/2016/5/10/chartex" xmlns:cx5="http://schemas.microsoft.com/office/drawing/2016/5/11/chartex" xmlns:cx6="http://schemas.microsoft.com/office/drawing/2016/5/12/chartex" xmlns:cx7="http://schemas.microsoft.com/office/drawing/2016/5/13/chartex" xmlns:cx8="http://schemas.microsoft.com/office/drawing/2016/5/14/chartex" xmlns:mc="http://schemas.openxmlformats.org/markup-compatibility/2006" xmlns:aink="http://schemas.microsoft.com/office/drawing/2016/ink" xmlns:am3d="http://schemas.microsoft.com/office/drawing/2017/model3d" xmlns:o="urn:schemas-microsoft-com:office:office" xmlns:oel="http://schemas.microsoft.com/office/2019/extlst" xmlns:r="http://schemas.openxmlformats.org/officeDocument/2006/relationships" xmlns:m="http://schemas.openxmlformats.org/officeDocument/2006/math" xmlns:v="urn:schemas-microsoft-com:vml" xmlns:wp14="http://schemas.microsoft.com/office/word/2010/wordprocessingDrawing" xmlns:wp="http://schemas.openxmlformats.org/drawingml/2006/wordprocessingDrawing" xmlns:w10="urn:schemas-microsoft-com:office:word" xmlns:w="http://schemas.openxmlformats.org/wordprocessingml/2006/main" xmlns:w14="http://schemas.microsoft.com/office/word/2010/wordml" xmlns:w15="http://schemas.microsoft.com/office/word/2012/wordml" xmlns:w16cex="http://schemas.microsoft.com/office/word/2018/wordml/cex" xmlns:w16cid="http://schemas.microsoft.com/office/word/2016/wordml/cid" xmlns:w16="http://schemas.microsoft.com/office/word/2018/wordml" xmlns:w16du="http://schemas.microsoft.com/office/word/2023/wordml/word16du" xmlns:w16sdtdh="http://schemas.microsoft.com/office/word/2020/wordml/sdtdatahash" xmlns:w16sdtfl="http://schemas.microsoft.com/office/word/2024/wordml/sdtformatlock" xmlns:w16se="http://schemas.microsoft.com/office/word/2015/wordml/symex" xmlns:wpg="http://schemas.microsoft.com/office/word/2010/wordprocessingGroup" xmlns:wpi="http://schemas.microsoft.com/office/word/2010/wordprocessingInk" xmlns:wne="http://schemas.microsoft.com/office/word/2006/wordml" xmlns:wps="http://schemas.microsoft.com/office/word/2010/wordprocessingShape" mc:Ignorable="w14 w15 w16se w16cid w16 w16cex w16sdtdh w16sdtfl w16du wp14">
+<w:footnotes xmlns:wpc="http://schemas.microsoft.com/office/word/2010/wordprocessingCanvas" xmlns:cx="http://schemas.microsoft.com/office/drawing/2014/chartex" xmlns:cx1="http://schemas.microsoft.com/office/drawing/2015/9/8/chartex" xmlns:cx2="http://schemas.microsoft.com/office/drawing/2015/10/21/chartex" xmlns:cx3="http://schemas.microsoft.com/office/drawing/2016/5/9/chartex" xmlns:cx4="http://schemas.microsoft.com/office/drawing/2016/5/10/chartex" xmlns:cx5="http://schemas.microsoft.com/office/drawing/2016/5/11/chartex" xmlns:cx6="http://schemas.microsoft.com/office/drawing/2016/5/12/chartex" xmlns:cx7="http://schemas.microsoft.com/office/drawing/2016/5/13/chartex" xmlns:cx8="http://schemas.microsoft.com/office/drawing/2016/5/14/chartex" xmlns:mc="http://schemas.openxmlformats.org/markup-compatibility/2006" xmlns:m="http://schemas.openxmlformats.org/officeDocument/2006/math" xmlns:aink="http://schemas.microsoft.com/office/drawing/2016/ink" xmlns:am3d="http://schemas.microsoft.com/office/drawing/2017/model3d" xmlns:oel="http://schemas.microsoft.com/office/2019/extlst" xmlns:r="http://schemas.openxmlformats.org/officeDocument/2006/relationships" xmlns:wp14="http://schemas.microsoft.com/office/word/2010/wordprocessingDrawing" xmlns:wp="http://schemas.openxmlformats.org/drawingml/2006/wordprocessingDrawing" xmlns:wpg="http://schemas.microsoft.com/office/word/2010/wordprocessingGroup" xmlns:wpi="http://schemas.microsoft.com/office/word/2010/wordprocessingInk" xmlns:wps="http://schemas.microsoft.com/office/word/2010/wordprocessingShape" xmlns:o="urn:schemas-microsoft-com:office:office" xmlns:v="urn:schemas-microsoft-com:vml" xmlns:w10="urn:schemas-microsoft-com:office:word" xmlns:w="http://schemas.openxmlformats.org/wordprocessingml/2006/main" xmlns:w14="http://schemas.microsoft.com/office/word/2010/wordml" xmlns:w15="http://schemas.microsoft.com/office/word/2012/wordml" xmlns:w16cex="http://schemas.microsoft.com/office/word/2018/wordml/cex" xmlns:w16cid="http://schemas.microsoft.com/office/word/2016/wordml/cid" xmlns:w16="http://schemas.microsoft.com/office/word/2018/wordml" xmlns:w16sdtdh="http://schemas.microsoft.com/office/word/2020/wordml/sdtdatahash" xmlns:w16sdtfl="http://schemas.microsoft.com/office/word/2024/wordml/sdtformatlock" xmlns:w16se="http://schemas.microsoft.com/office/word/2015/wordml/symex" xmlns:w16du="http://schemas.microsoft.com/office/word/2023/wordml/word16du" xmlns:wne="http://schemas.microsoft.com/office/word/2006/wordml" mc:Ignorable="w14 w15 w16se w16cid w16 w16cex w16sdtdh w16sdtfl w16du wp14">
   <w:footnote w:type="separator" w:id="-1">
     <w:p>
       <w:r>
@@ -6440,7 +6468,7 @@
 </file>
 
 <file path=word/header1.xml><?xml version="1.0" encoding="utf-8"?>
-<w:hdr xmlns:wpc="http://schemas.microsoft.com/office/word/2010/wordprocessingCanvas" xmlns:cx="http://schemas.microsoft.com/office/drawing/2014/chartex" xmlns:cx1="http://schemas.microsoft.com/office/drawing/2015/9/8/chartex" xmlns:cx2="http://schemas.microsoft.com/office/drawing/2015/10/21/chartex" xmlns:cx3="http://schemas.microsoft.com/office/drawing/2016/5/9/chartex" xmlns:cx4="http://schemas.microsoft.com/office/drawing/2016/5/10/chartex" xmlns:cx5="http://schemas.microsoft.com/office/drawing/2016/5/11/chartex" xmlns:cx6="http://schemas.microsoft.com/office/drawing/2016/5/12/chartex" xmlns:cx7="http://schemas.microsoft.com/office/drawing/2016/5/13/chartex" xmlns:cx8="http://schemas.microsoft.com/office/drawing/2016/5/14/chartex" xmlns:mc="http://schemas.openxmlformats.org/markup-compatibility/2006" xmlns:aink="http://schemas.microsoft.com/office/drawing/2016/ink" xmlns:am3d="http://schemas.microsoft.com/office/drawing/2017/model3d" xmlns:o="urn:schemas-microsoft-com:office:office" xmlns:oel="http://schemas.microsoft.com/office/2019/extlst" xmlns:r="http://schemas.openxmlformats.org/officeDocument/2006/relationships" xmlns:m="http://schemas.openxmlformats.org/officeDocument/2006/math" xmlns:v="urn:schemas-microsoft-com:vml" xmlns:wp14="http://schemas.microsoft.com/office/word/2010/wordprocessingDrawing" xmlns:wp="http://schemas.openxmlformats.org/drawingml/2006/wordprocessingDrawing" xmlns:w10="urn:schemas-microsoft-com:office:word" xmlns:w="http://schemas.openxmlformats.org/wordprocessingml/2006/main" xmlns:w14="http://schemas.microsoft.com/office/word/2010/wordml" xmlns:w15="http://schemas.microsoft.com/office/word/2012/wordml" xmlns:w16cex="http://schemas.microsoft.com/office/word/2018/wordml/cex" xmlns:w16cid="http://schemas.microsoft.com/office/word/2016/wordml/cid" xmlns:w16="http://schemas.microsoft.com/office/word/2018/wordml" xmlns:w16du="http://schemas.microsoft.com/office/word/2023/wordml/word16du" xmlns:w16sdtdh="http://schemas.microsoft.com/office/word/2020/wordml/sdtdatahash" xmlns:w16sdtfl="http://schemas.microsoft.com/office/word/2024/wordml/sdtformatlock" xmlns:w16se="http://schemas.microsoft.com/office/word/2015/wordml/symex" xmlns:wpg="http://schemas.microsoft.com/office/word/2010/wordprocessingGroup" xmlns:wpi="http://schemas.microsoft.com/office/word/2010/wordprocessingInk" xmlns:wne="http://schemas.microsoft.com/office/word/2006/wordml" xmlns:wps="http://schemas.microsoft.com/office/word/2010/wordprocessingShape" mc:Ignorable="w14 w15 w16se w16cid w16 w16cex w16sdtdh w16sdtfl w16du wp14">
+<w:hdr xmlns:wpc="http://schemas.microsoft.com/office/word/2010/wordprocessingCanvas" xmlns:cx="http://schemas.microsoft.com/office/drawing/2014/chartex" xmlns:cx1="http://schemas.microsoft.com/office/drawing/2015/9/8/chartex" xmlns:cx2="http://schemas.microsoft.com/office/drawing/2015/10/21/chartex" xmlns:cx3="http://schemas.microsoft.com/office/drawing/2016/5/9/chartex" xmlns:cx4="http://schemas.microsoft.com/office/drawing/2016/5/10/chartex" xmlns:cx5="http://schemas.microsoft.com/office/drawing/2016/5/11/chartex" xmlns:cx6="http://schemas.microsoft.com/office/drawing/2016/5/12/chartex" xmlns:cx7="http://schemas.microsoft.com/office/drawing/2016/5/13/chartex" xmlns:cx8="http://schemas.microsoft.com/office/drawing/2016/5/14/chartex" xmlns:mc="http://schemas.openxmlformats.org/markup-compatibility/2006" xmlns:m="http://schemas.openxmlformats.org/officeDocument/2006/math" xmlns:aink="http://schemas.microsoft.com/office/drawing/2016/ink" xmlns:am3d="http://schemas.microsoft.com/office/drawing/2017/model3d" xmlns:oel="http://schemas.microsoft.com/office/2019/extlst" xmlns:r="http://schemas.openxmlformats.org/officeDocument/2006/relationships" xmlns:wp14="http://schemas.microsoft.com/office/word/2010/wordprocessingDrawing" xmlns:wp="http://schemas.openxmlformats.org/drawingml/2006/wordprocessingDrawing" xmlns:wpg="http://schemas.microsoft.com/office/word/2010/wordprocessingGroup" xmlns:wpi="http://schemas.microsoft.com/office/word/2010/wordprocessingInk" xmlns:wps="http://schemas.microsoft.com/office/word/2010/wordprocessingShape" xmlns:o="urn:schemas-microsoft-com:office:office" xmlns:v="urn:schemas-microsoft-com:vml" xmlns:w10="urn:schemas-microsoft-com:office:word" xmlns:w="http://schemas.openxmlformats.org/wordprocessingml/2006/main" xmlns:w14="http://schemas.microsoft.com/office/word/2010/wordml" xmlns:w15="http://schemas.microsoft.com/office/word/2012/wordml" xmlns:w16cex="http://schemas.microsoft.com/office/word/2018/wordml/cex" xmlns:w16cid="http://schemas.microsoft.com/office/word/2016/wordml/cid" xmlns:w16="http://schemas.microsoft.com/office/word/2018/wordml" xmlns:w16sdtdh="http://schemas.microsoft.com/office/word/2020/wordml/sdtdatahash" xmlns:w16sdtfl="http://schemas.microsoft.com/office/word/2024/wordml/sdtformatlock" xmlns:w16se="http://schemas.microsoft.com/office/word/2015/wordml/symex" xmlns:w16du="http://schemas.microsoft.com/office/word/2023/wordml/word16du" xmlns:wne="http://schemas.microsoft.com/office/word/2006/wordml" mc:Ignorable="w14 w15 w16se w16cid w16 w16cex w16sdtdh w16sdtfl w16du wp14">
   <w:p>
     <w:pPr>
       <w:pStyle w:val="Header"/>
@@ -6450,7 +6478,7 @@
 </file>
 
 <file path=word/header2.xml><?xml version="1.0" encoding="utf-8"?>
-<w:hdr xmlns:wpc="http://schemas.microsoft.com/office/word/2010/wordprocessingCanvas" xmlns:cx="http://schemas.microsoft.com/office/drawing/2014/chartex" xmlns:cx1="http://schemas.microsoft.com/office/drawing/2015/9/8/chartex" xmlns:cx2="http://schemas.microsoft.com/office/drawing/2015/10/21/chartex" xmlns:cx3="http://schemas.microsoft.com/office/drawing/2016/5/9/chartex" xmlns:cx4="http://schemas.microsoft.com/office/drawing/2016/5/10/chartex" xmlns:cx5="http://schemas.microsoft.com/office/drawing/2016/5/11/chartex" xmlns:cx6="http://schemas.microsoft.com/office/drawing/2016/5/12/chartex" xmlns:cx7="http://schemas.microsoft.com/office/drawing/2016/5/13/chartex" xmlns:cx8="http://schemas.microsoft.com/office/drawing/2016/5/14/chartex" xmlns:mc="http://schemas.openxmlformats.org/markup-compatibility/2006" xmlns:aink="http://schemas.microsoft.com/office/drawing/2016/ink" xmlns:am3d="http://schemas.microsoft.com/office/drawing/2017/model3d" xmlns:o="urn:schemas-microsoft-com:office:office" xmlns:oel="http://schemas.microsoft.com/office/2019/extlst" xmlns:r="http://schemas.openxmlformats.org/officeDocument/2006/relationships" xmlns:m="http://schemas.openxmlformats.org/officeDocument/2006/math" xmlns:v="urn:schemas-microsoft-com:vml" xmlns:wp14="http://schemas.microsoft.com/office/word/2010/wordprocessingDrawing" xmlns:wp="http://schemas.openxmlformats.org/drawingml/2006/wordprocessingDrawing" xmlns:w10="urn:schemas-microsoft-com:office:word" xmlns:w="http://schemas.openxmlformats.org/wordprocessingml/2006/main" xmlns:w14="http://schemas.microsoft.com/office/word/2010/wordml" xmlns:w15="http://schemas.microsoft.com/office/word/2012/wordml" xmlns:w16cex="http://schemas.microsoft.com/office/word/2018/wordml/cex" xmlns:w16cid="http://schemas.microsoft.com/office/word/2016/wordml/cid" xmlns:w16="http://schemas.microsoft.com/office/word/2018/wordml" xmlns:w16du="http://schemas.microsoft.com/office/word/2023/wordml/word16du" xmlns:w16sdtdh="http://schemas.microsoft.com/office/word/2020/wordml/sdtdatahash" xmlns:w16sdtfl="http://schemas.microsoft.com/office/word/2024/wordml/sdtformatlock" xmlns:w16se="http://schemas.microsoft.com/office/word/2015/wordml/symex" xmlns:wpg="http://schemas.microsoft.com/office/word/2010/wordprocessingGroup" xmlns:wpi="http://schemas.microsoft.com/office/word/2010/wordprocessingInk" xmlns:wne="http://schemas.microsoft.com/office/word/2006/wordml" xmlns:wps="http://schemas.microsoft.com/office/word/2010/wordprocessingShape" mc:Ignorable="w14 w15 w16se w16cid w16 w16cex w16sdtdh w16sdtfl w16du wp14">
+<w:hdr xmlns:wpc="http://schemas.microsoft.com/office/word/2010/wordprocessingCanvas" xmlns:cx="http://schemas.microsoft.com/office/drawing/2014/chartex" xmlns:cx1="http://schemas.microsoft.com/office/drawing/2015/9/8/chartex" xmlns:cx2="http://schemas.microsoft.com/office/drawing/2015/10/21/chartex" xmlns:cx3="http://schemas.microsoft.com/office/drawing/2016/5/9/chartex" xmlns:cx4="http://schemas.microsoft.com/office/drawing/2016/5/10/chartex" xmlns:cx5="http://schemas.microsoft.com/office/drawing/2016/5/11/chartex" xmlns:cx6="http://schemas.microsoft.com/office/drawing/2016/5/12/chartex" xmlns:cx7="http://schemas.microsoft.com/office/drawing/2016/5/13/chartex" xmlns:cx8="http://schemas.microsoft.com/office/drawing/2016/5/14/chartex" xmlns:mc="http://schemas.openxmlformats.org/markup-compatibility/2006" xmlns:m="http://schemas.openxmlformats.org/officeDocument/2006/math" xmlns:aink="http://schemas.microsoft.com/office/drawing/2016/ink" xmlns:am3d="http://schemas.microsoft.com/office/drawing/2017/model3d" xmlns:oel="http://schemas.microsoft.com/office/2019/extlst" xmlns:r="http://schemas.openxmlformats.org/officeDocument/2006/relationships" xmlns:wp14="http://schemas.microsoft.com/office/word/2010/wordprocessingDrawing" xmlns:wp="http://schemas.openxmlformats.org/drawingml/2006/wordprocessingDrawing" xmlns:wpg="http://schemas.microsoft.com/office/word/2010/wordprocessingGroup" xmlns:wpi="http://schemas.microsoft.com/office/word/2010/wordprocessingInk" xmlns:wps="http://schemas.microsoft.com/office/word/2010/wordprocessingShape" xmlns:o="urn:schemas-microsoft-com:office:office" xmlns:v="urn:schemas-microsoft-com:vml" xmlns:w10="urn:schemas-microsoft-com:office:word" xmlns:w="http://schemas.openxmlformats.org/wordprocessingml/2006/main" xmlns:w14="http://schemas.microsoft.com/office/word/2010/wordml" xmlns:w15="http://schemas.microsoft.com/office/word/2012/wordml" xmlns:w16cex="http://schemas.microsoft.com/office/word/2018/wordml/cex" xmlns:w16cid="http://schemas.microsoft.com/office/word/2016/wordml/cid" xmlns:w16="http://schemas.microsoft.com/office/word/2018/wordml" xmlns:w16sdtdh="http://schemas.microsoft.com/office/word/2020/wordml/sdtdatahash" xmlns:w16sdtfl="http://schemas.microsoft.com/office/word/2024/wordml/sdtformatlock" xmlns:w16se="http://schemas.microsoft.com/office/word/2015/wordml/symex" xmlns:w16du="http://schemas.microsoft.com/office/word/2023/wordml/word16du" xmlns:wne="http://schemas.microsoft.com/office/word/2006/wordml" mc:Ignorable="w14 w15 w16se w16cid w16 w16cex w16sdtdh w16sdtfl w16du wp14">
   <w:p>
     <w:pPr>
       <w:pStyle w:val="Header"/>
@@ -6501,7 +6529,7 @@
 </file>
 
 <file path=word/header3.xml><?xml version="1.0" encoding="utf-8"?>
-<w:hdr xmlns:wpc="http://schemas.microsoft.com/office/word/2010/wordprocessingCanvas" xmlns:cx="http://schemas.microsoft.com/office/drawing/2014/chartex" xmlns:cx1="http://schemas.microsoft.com/office/drawing/2015/9/8/chartex" xmlns:cx2="http://schemas.microsoft.com/office/drawing/2015/10/21/chartex" xmlns:cx3="http://schemas.microsoft.com/office/drawing/2016/5/9/chartex" xmlns:cx4="http://schemas.microsoft.com/office/drawing/2016/5/10/chartex" xmlns:cx5="http://schemas.microsoft.com/office/drawing/2016/5/11/chartex" xmlns:cx6="http://schemas.microsoft.com/office/drawing/2016/5/12/chartex" xmlns:cx7="http://schemas.microsoft.com/office/drawing/2016/5/13/chartex" xmlns:cx8="http://schemas.microsoft.com/office/drawing/2016/5/14/chartex" xmlns:mc="http://schemas.openxmlformats.org/markup-compatibility/2006" xmlns:aink="http://schemas.microsoft.com/office/drawing/2016/ink" xmlns:am3d="http://schemas.microsoft.com/office/drawing/2017/model3d" xmlns:o="urn:schemas-microsoft-com:office:office" xmlns:oel="http://schemas.microsoft.com/office/2019/extlst" xmlns:r="http://schemas.openxmlformats.org/officeDocument/2006/relationships" xmlns:m="http://schemas.openxmlformats.org/officeDocument/2006/math" xmlns:v="urn:schemas-microsoft-com:vml" xmlns:wp14="http://schemas.microsoft.com/office/word/2010/wordprocessingDrawing" xmlns:wp="http://schemas.openxmlformats.org/drawingml/2006/wordprocessingDrawing" xmlns:w10="urn:schemas-microsoft-com:office:word" xmlns:w="http://schemas.openxmlformats.org/wordprocessingml/2006/main" xmlns:w14="http://schemas.microsoft.com/office/word/2010/wordml" xmlns:w15="http://schemas.microsoft.com/office/word/2012/wordml" xmlns:w16cex="http://schemas.microsoft.com/office/word/2018/wordml/cex" xmlns:w16cid="http://schemas.microsoft.com/office/word/2016/wordml/cid" xmlns:w16="http://schemas.microsoft.com/office/word/2018/wordml" xmlns:w16du="http://schemas.microsoft.com/office/word/2023/wordml/word16du" xmlns:w16sdtdh="http://schemas.microsoft.com/office/word/2020/wordml/sdtdatahash" xmlns:w16sdtfl="http://schemas.microsoft.com/office/word/2024/wordml/sdtformatlock" xmlns:w16se="http://schemas.microsoft.com/office/word/2015/wordml/symex" xmlns:wpg="http://schemas.microsoft.com/office/word/2010/wordprocessingGroup" xmlns:wpi="http://schemas.microsoft.com/office/word/2010/wordprocessingInk" xmlns:wne="http://schemas.microsoft.com/office/word/2006/wordml" xmlns:wps="http://schemas.microsoft.com/office/word/2010/wordprocessingShape" mc:Ignorable="w14 w15 w16se w16cid w16 w16cex w16sdtdh w16sdtfl w16du wp14">
+<w:hdr xmlns:wpc="http://schemas.microsoft.com/office/word/2010/wordprocessingCanvas" xmlns:cx="http://schemas.microsoft.com/office/drawing/2014/chartex" xmlns:cx1="http://schemas.microsoft.com/office/drawing/2015/9/8/chartex" xmlns:cx2="http://schemas.microsoft.com/office/drawing/2015/10/21/chartex" xmlns:cx3="http://schemas.microsoft.com/office/drawing/2016/5/9/chartex" xmlns:cx4="http://schemas.microsoft.com/office/drawing/2016/5/10/chartex" xmlns:cx5="http://schemas.microsoft.com/office/drawing/2016/5/11/chartex" xmlns:cx6="http://schemas.microsoft.com/office/drawing/2016/5/12/chartex" xmlns:cx7="http://schemas.microsoft.com/office/drawing/2016/5/13/chartex" xmlns:cx8="http://schemas.microsoft.com/office/drawing/2016/5/14/chartex" xmlns:mc="http://schemas.openxmlformats.org/markup-compatibility/2006" xmlns:m="http://schemas.openxmlformats.org/officeDocument/2006/math" xmlns:aink="http://schemas.microsoft.com/office/drawing/2016/ink" xmlns:am3d="http://schemas.microsoft.com/office/drawing/2017/model3d" xmlns:oel="http://schemas.microsoft.com/office/2019/extlst" xmlns:r="http://schemas.openxmlformats.org/officeDocument/2006/relationships" xmlns:wp14="http://schemas.microsoft.com/office/word/2010/wordprocessingDrawing" xmlns:wp="http://schemas.openxmlformats.org/drawingml/2006/wordprocessingDrawing" xmlns:wpg="http://schemas.microsoft.com/office/word/2010/wordprocessingGroup" xmlns:wpi="http://schemas.microsoft.com/office/word/2010/wordprocessingInk" xmlns:wps="http://schemas.microsoft.com/office/word/2010/wordprocessingShape" xmlns:o="urn:schemas-microsoft-com:office:office" xmlns:v="urn:schemas-microsoft-com:vml" xmlns:w10="urn:schemas-microsoft-com:office:word" xmlns:w="http://schemas.openxmlformats.org/wordprocessingml/2006/main" xmlns:w14="http://schemas.microsoft.com/office/word/2010/wordml" xmlns:w15="http://schemas.microsoft.com/office/word/2012/wordml" xmlns:w16cex="http://schemas.microsoft.com/office/word/2018/wordml/cex" xmlns:w16cid="http://schemas.microsoft.com/office/word/2016/wordml/cid" xmlns:w16="http://schemas.microsoft.com/office/word/2018/wordml" xmlns:w16sdtdh="http://schemas.microsoft.com/office/word/2020/wordml/sdtdatahash" xmlns:w16sdtfl="http://schemas.microsoft.com/office/word/2024/wordml/sdtformatlock" xmlns:w16se="http://schemas.microsoft.com/office/word/2015/wordml/symex" xmlns:w16du="http://schemas.microsoft.com/office/word/2023/wordml/word16du" xmlns:wne="http://schemas.microsoft.com/office/word/2006/wordml" mc:Ignorable="w14 w15 w16se w16cid w16 w16cex w16sdtdh w16sdtfl w16du wp14">
   <w:p>
     <w:pPr>
       <w:pStyle w:val="Header"/>
@@ -6511,7 +6539,7 @@
 </file>
 
 <file path=word/numbering.xml><?xml version="1.0" encoding="utf-8"?>
-<w:numbering xmlns:wpc="http://schemas.microsoft.com/office/word/2010/wordprocessingCanvas" xmlns:cx="http://schemas.microsoft.com/office/drawing/2014/chartex" xmlns:cx1="http://schemas.microsoft.com/office/drawing/2015/9/8/chartex" xmlns:cx2="http://schemas.microsoft.com/office/drawing/2015/10/21/chartex" xmlns:cx3="http://schemas.microsoft.com/office/drawing/2016/5/9/chartex" xmlns:cx4="http://schemas.microsoft.com/office/drawing/2016/5/10/chartex" xmlns:cx5="http://schemas.microsoft.com/office/drawing/2016/5/11/chartex" xmlns:cx6="http://schemas.microsoft.com/office/drawing/2016/5/12/chartex" xmlns:cx7="http://schemas.microsoft.com/office/drawing/2016/5/13/chartex" xmlns:cx8="http://schemas.microsoft.com/office/drawing/2016/5/14/chartex" xmlns:mc="http://schemas.openxmlformats.org/markup-compatibility/2006" xmlns:aink="http://schemas.microsoft.com/office/drawing/2016/ink" xmlns:am3d="http://schemas.microsoft.com/office/drawing/2017/model3d" xmlns:o="urn:schemas-microsoft-com:office:office" xmlns:oel="http://schemas.microsoft.com/office/2019/extlst" xmlns:r="http://schemas.openxmlformats.org/officeDocument/2006/relationships" xmlns:m="http://schemas.openxmlformats.org/officeDocument/2006/math" xmlns:v="urn:schemas-microsoft-com:vml" xmlns:wp14="http://schemas.microsoft.com/office/word/2010/wordprocessingDrawing" xmlns:wp="http://schemas.openxmlformats.org/drawingml/2006/wordprocessingDrawing" xmlns:w10="urn:schemas-microsoft-com:office:word" xmlns:w="http://schemas.openxmlformats.org/wordprocessingml/2006/main" xmlns:w14="http://schemas.microsoft.com/office/word/2010/wordml" xmlns:w15="http://schemas.microsoft.com/office/word/2012/wordml" xmlns:w16cex="http://schemas.microsoft.com/office/word/2018/wordml/cex" xmlns:w16cid="http://schemas.microsoft.com/office/word/2016/wordml/cid" xmlns:w16="http://schemas.microsoft.com/office/word/2018/wordml" xmlns:w16du="http://schemas.microsoft.com/office/word/2023/wordml/word16du" xmlns:w16sdtdh="http://schemas.microsoft.com/office/word/2020/wordml/sdtdatahash" xmlns:w16sdtfl="http://schemas.microsoft.com/office/word/2024/wordml/sdtformatlock" xmlns:w16se="http://schemas.microsoft.com/office/word/2015/wordml/symex" xmlns:wpg="http://schemas.microsoft.com/office/word/2010/wordprocessingGroup" xmlns:wpi="http://schemas.microsoft.com/office/word/2010/wordprocessingInk" xmlns:wne="http://schemas.microsoft.com/office/word/2006/wordml" xmlns:wps="http://schemas.microsoft.com/office/word/2010/wordprocessingShape" mc:Ignorable="w14 w15 w16se w16cid w16 w16cex w16sdtdh w16sdtfl w16du wp14">
+<w:numbering xmlns:wpc="http://schemas.microsoft.com/office/word/2010/wordprocessingCanvas" xmlns:cx="http://schemas.microsoft.com/office/drawing/2014/chartex" xmlns:cx1="http://schemas.microsoft.com/office/drawing/2015/9/8/chartex" xmlns:cx2="http://schemas.microsoft.com/office/drawing/2015/10/21/chartex" xmlns:cx3="http://schemas.microsoft.com/office/drawing/2016/5/9/chartex" xmlns:cx4="http://schemas.microsoft.com/office/drawing/2016/5/10/chartex" xmlns:cx5="http://schemas.microsoft.com/office/drawing/2016/5/11/chartex" xmlns:cx6="http://schemas.microsoft.com/office/drawing/2016/5/12/chartex" xmlns:cx7="http://schemas.microsoft.com/office/drawing/2016/5/13/chartex" xmlns:cx8="http://schemas.microsoft.com/office/drawing/2016/5/14/chartex" xmlns:mc="http://schemas.openxmlformats.org/markup-compatibility/2006" xmlns:m="http://schemas.openxmlformats.org/officeDocument/2006/math" xmlns:aink="http://schemas.microsoft.com/office/drawing/2016/ink" xmlns:am3d="http://schemas.microsoft.com/office/drawing/2017/model3d" xmlns:oel="http://schemas.microsoft.com/office/2019/extlst" xmlns:r="http://schemas.openxmlformats.org/officeDocument/2006/relationships" xmlns:wp14="http://schemas.microsoft.com/office/word/2010/wordprocessingDrawing" xmlns:wp="http://schemas.openxmlformats.org/drawingml/2006/wordprocessingDrawing" xmlns:wpg="http://schemas.microsoft.com/office/word/2010/wordprocessingGroup" xmlns:wpi="http://schemas.microsoft.com/office/word/2010/wordprocessingInk" xmlns:wps="http://schemas.microsoft.com/office/word/2010/wordprocessingShape" xmlns:o="urn:schemas-microsoft-com:office:office" xmlns:v="urn:schemas-microsoft-com:vml" xmlns:w10="urn:schemas-microsoft-com:office:word" xmlns:w="http://schemas.openxmlformats.org/wordprocessingml/2006/main" xmlns:w14="http://schemas.microsoft.com/office/word/2010/wordml" xmlns:w15="http://schemas.microsoft.com/office/word/2012/wordml" xmlns:w16cex="http://schemas.microsoft.com/office/word/2018/wordml/cex" xmlns:w16cid="http://schemas.microsoft.com/office/word/2016/wordml/cid" xmlns:w16="http://schemas.microsoft.com/office/word/2018/wordml" xmlns:w16sdtdh="http://schemas.microsoft.com/office/word/2020/wordml/sdtdatahash" xmlns:w16sdtfl="http://schemas.microsoft.com/office/word/2024/wordml/sdtformatlock" xmlns:w16se="http://schemas.microsoft.com/office/word/2015/wordml/symex" xmlns:w16du="http://schemas.microsoft.com/office/word/2023/wordml/word16du" xmlns:wne="http://schemas.microsoft.com/office/word/2006/wordml" mc:Ignorable="w14 w15 w16se w16cid w16 w16cex w16sdtdh w16sdtfl w16du wp14">
   <w:abstractNum w:abstractNumId="0" w15:restartNumberingAfterBreak="0">
     <w:nsid w:val="FFFFFF1D"/>
     <w:multiLevelType w:val="multilevel"/>
@@ -8091,7 +8119,7 @@
 </file>
 
 <file path=word/styles.xml><?xml version="1.0" encoding="utf-8"?>
-<w:styles xmlns:mc="http://schemas.openxmlformats.org/markup-compatibility/2006" xmlns:r="http://schemas.openxmlformats.org/officeDocument/2006/relationships" xmlns:w="http://schemas.openxmlformats.org/wordprocessingml/2006/main" xmlns:w14="http://schemas.microsoft.com/office/word/2010/wordml" xmlns:w15="http://schemas.microsoft.com/office/word/2012/wordml" xmlns:w16cex="http://schemas.microsoft.com/office/word/2018/wordml/cex" xmlns:w16cid="http://schemas.microsoft.com/office/word/2016/wordml/cid" xmlns:w16="http://schemas.microsoft.com/office/word/2018/wordml" xmlns:w16du="http://schemas.microsoft.com/office/word/2023/wordml/word16du" xmlns:w16sdtdh="http://schemas.microsoft.com/office/word/2020/wordml/sdtdatahash" xmlns:w16sdtfl="http://schemas.microsoft.com/office/word/2024/wordml/sdtformatlock" xmlns:w16se="http://schemas.microsoft.com/office/word/2015/wordml/symex" mc:Ignorable="w14 w15 w16se w16cid w16 w16cex w16sdtdh w16sdtfl w16du">
+<w:styles xmlns:mc="http://schemas.openxmlformats.org/markup-compatibility/2006" xmlns:r="http://schemas.openxmlformats.org/officeDocument/2006/relationships" xmlns:w="http://schemas.openxmlformats.org/wordprocessingml/2006/main" xmlns:w14="http://schemas.microsoft.com/office/word/2010/wordml" xmlns:w15="http://schemas.microsoft.com/office/word/2012/wordml" xmlns:w16cex="http://schemas.microsoft.com/office/word/2018/wordml/cex" xmlns:w16cid="http://schemas.microsoft.com/office/word/2016/wordml/cid" xmlns:w16="http://schemas.microsoft.com/office/word/2018/wordml" xmlns:w16sdtdh="http://schemas.microsoft.com/office/word/2020/wordml/sdtdatahash" xmlns:w16sdtfl="http://schemas.microsoft.com/office/word/2024/wordml/sdtformatlock" xmlns:w16se="http://schemas.microsoft.com/office/word/2015/wordml/symex" xmlns:w16du="http://schemas.microsoft.com/office/word/2023/wordml/word16du" mc:Ignorable="w14 w15 w16se w16cid w16 w16cex w16sdtdh w16sdtfl w16du">
   <w:docDefaults>
     <w:rPrDefault>
       <w:rPr>

</xml_diff>